<commit_message>
Srs UseCase Diagram Added
</commit_message>
<xml_diff>
--- a/CampusXchange_SRS.docx
+++ b/CampusXchange_SRS.docx
@@ -12,7 +12,7 @@
           <w:noProof/>
         </w:rPr>
         <w:drawing>
-          <wp:inline distT="0" distB="0" distL="0" distR="0" wp14:anchorId="68FA4D2F" wp14:editId="656FE16F">
+          <wp:inline distT="0" distB="0" distL="0" distR="0" wp14:anchorId="7E10A7DD" wp14:editId="6004B27C">
             <wp:extent cx="857250" cy="857250"/>
             <wp:effectExtent l="0" t="0" r="0" b="0"/>
             <wp:docPr id="1" name="Picture 1"/>
@@ -1493,6 +1493,130 @@
         <w:t xml:space="preserve"> or their account suspended, together with the reason recorded by the administrator.</w:t>
       </w:r>
     </w:p>
+    <w:p>
+      <w:pPr>
+        <w:pStyle w:val="Heading1"/>
+        <w:spacing w:before="360" w:after="180"/>
+      </w:pPr>
+      <w:r>
+        <w:rPr>
+          <w:b/>
+          <w:bCs/>
+          <w:sz w:val="30"/>
+          <w:szCs w:val="30"/>
+        </w:rPr>
+        <w:t>3. USE CASE DIAGRAM</w:t>
+      </w:r>
+    </w:p>
+    <w:p>
+      <w:pPr>
+        <w:spacing w:before="120" w:after="120"/>
+        <w:jc w:val="center"/>
+      </w:pPr>
+      <w:r>
+        <w:rPr>
+          <w:noProof/>
+        </w:rPr>
+        <w:lastRenderedPageBreak/>
+        <w:drawing>
+          <wp:inline distT="0" distB="0" distL="0" distR="0" wp14:anchorId="2F4019C9" wp14:editId="492A0C96">
+            <wp:extent cx="5760720" cy="4367320"/>
+            <wp:effectExtent l="0" t="0" r="0" b="0"/>
+            <wp:docPr id="2" name="Picture 2"/>
+            <wp:cNvGraphicFramePr>
+              <a:graphicFrameLocks xmlns:a="http://schemas.openxmlformats.org/drawingml/2006/main" noChangeAspect="1"/>
+            </wp:cNvGraphicFramePr>
+            <a:graphic xmlns:a="http://schemas.openxmlformats.org/drawingml/2006/main">
+              <a:graphicData uri="http://schemas.openxmlformats.org/drawingml/2006/picture">
+                <pic:pic xmlns:pic="http://schemas.openxmlformats.org/drawingml/2006/picture">
+                  <pic:nvPicPr>
+                    <pic:cNvPr id="0" name=""/>
+                    <pic:cNvPicPr>
+                      <a:picLocks noChangeAspect="1" noChangeArrowheads="1"/>
+                    </pic:cNvPicPr>
+                  </pic:nvPicPr>
+                  <pic:blipFill>
+                    <a:blip r:embed="rId6"/>
+                    <a:srcRect/>
+                    <a:stretch>
+                      <a:fillRect/>
+                    </a:stretch>
+                  </pic:blipFill>
+                  <pic:spPr bwMode="auto">
+                    <a:xfrm>
+                      <a:off x="0" y="0"/>
+                      <a:ext cx="5760720" cy="4367320"/>
+                    </a:xfrm>
+                    <a:prstGeom prst="rect">
+                      <a:avLst/>
+                    </a:prstGeom>
+                  </pic:spPr>
+                </pic:pic>
+              </a:graphicData>
+            </a:graphic>
+          </wp:inline>
+        </w:drawing>
+      </w:r>
+    </w:p>
+    <w:p>
+      <w:pPr>
+        <w:spacing w:after="60"/>
+        <w:jc w:val="center"/>
+      </w:pPr>
+      <w:r>
+        <w:rPr>
+          <w:i/>
+          <w:iCs/>
+          <w:sz w:val="20"/>
+          <w:szCs w:val="20"/>
+        </w:rPr>
+        <w:t xml:space="preserve">Figure 1: Use Case Diagram for </w:t>
+      </w:r>
+      <w:proofErr w:type="spellStart"/>
+      <w:r>
+        <w:rPr>
+          <w:i/>
+          <w:iCs/>
+          <w:sz w:val="20"/>
+          <w:szCs w:val="20"/>
+        </w:rPr>
+        <w:t>CampusXchange</w:t>
+      </w:r>
+      <w:proofErr w:type="spellEnd"/>
+    </w:p>
+    <w:p>
+      <w:pPr>
+        <w:spacing w:after="160"/>
+        <w:jc w:val="both"/>
+      </w:pPr>
+      <w:r>
+        <w:t xml:space="preserve">The diagram above identifies three actors that interact with the </w:t>
+      </w:r>
+      <w:proofErr w:type="spellStart"/>
+      <w:r>
+        <w:t>CampusXchange</w:t>
+      </w:r>
+      <w:proofErr w:type="spellEnd"/>
+      <w:r>
+        <w:t xml:space="preserve"> system: the </w:t>
+      </w:r>
+      <w:proofErr w:type="gramStart"/>
+      <w:r>
+        <w:t>Student</w:t>
+      </w:r>
+      <w:proofErr w:type="gramEnd"/>
+      <w:r>
+        <w:t xml:space="preserve">, who acts as both buyer and seller; the Administrator; and the Notification Service. The Notification Service is not a person but an external system that the application depends on, so it is drawn as a stereotyped box rather than a stick figure. A Student registers and logs in, which includes verifying their university email address before access is granted. Once authenticated, a </w:t>
+      </w:r>
+      <w:proofErr w:type="gramStart"/>
+      <w:r>
+        <w:t>Student</w:t>
+      </w:r>
+      <w:proofErr w:type="gramEnd"/>
+      <w:r>
+        <w:t xml:space="preserve"> can create, edit, or delete listings; search and filter listings posted by others; message another student about a specific listing; mark an item as sold once a transaction is complete; and rate the counterparty afterwards. The Administrator suspends user accounts and moderates or removes listings that violate platform policy. Three use cases depend on the Notification Service and are therefore linked to Send Notification by an «include» relationship: messaging a buyer or seller alerts the recipient, while suspending an account or removing a listing informs the affected user of the action and its recorded reason.</w:t>
+      </w:r>
+    </w:p>
     <w:sectPr>
       <w:pgSz w:w="12240" w:h="15840"/>
       <w:pgMar w:top="1440" w:right="1440" w:bottom="1440" w:left="1440" w:header="708" w:footer="708" w:gutter="0"/>
@@ -1506,96 +1630,10 @@
 <file path=word/numbering.xml><?xml version="1.0" encoding="utf-8"?>
 <w:numbering xmlns:wpc="http://schemas.microsoft.com/office/word/2010/wordprocessingCanvas" xmlns:cx="http://schemas.microsoft.com/office/drawing/2014/chartex" xmlns:cx1="http://schemas.microsoft.com/office/drawing/2015/9/8/chartex" xmlns:cx2="http://schemas.microsoft.com/office/drawing/2015/10/21/chartex" xmlns:cx3="http://schemas.microsoft.com/office/drawing/2016/5/9/chartex" xmlns:cx4="http://schemas.microsoft.com/office/drawing/2016/5/10/chartex" xmlns:cx5="http://schemas.microsoft.com/office/drawing/2016/5/11/chartex" xmlns:cx6="http://schemas.microsoft.com/office/drawing/2016/5/12/chartex" xmlns:cx7="http://schemas.microsoft.com/office/drawing/2016/5/13/chartex" xmlns:cx8="http://schemas.microsoft.com/office/drawing/2016/5/14/chartex" xmlns:mc="http://schemas.openxmlformats.org/markup-compatibility/2006" xmlns:aink="http://schemas.microsoft.com/office/drawing/2016/ink" xmlns:am3d="http://schemas.microsoft.com/office/drawing/2017/model3d" xmlns:o="urn:schemas-microsoft-com:office:office" xmlns:oel="http://schemas.microsoft.com/office/2019/extlst" xmlns:r="http://schemas.openxmlformats.org/officeDocument/2006/relationships" xmlns:m="http://schemas.openxmlformats.org/officeDocument/2006/math" xmlns:v="urn:schemas-microsoft-com:vml" xmlns:wp14="http://schemas.microsoft.com/office/word/2010/wordprocessingDrawing" xmlns:wp="http://schemas.openxmlformats.org/drawingml/2006/wordprocessingDrawing" xmlns:w10="urn:schemas-microsoft-com:office:word" xmlns:w="http://schemas.openxmlformats.org/wordprocessingml/2006/main" xmlns:w14="http://schemas.microsoft.com/office/word/2010/wordml" xmlns:w15="http://schemas.microsoft.com/office/word/2012/wordml" xmlns:w16cex="http://schemas.microsoft.com/office/word/2018/wordml/cex" xmlns:w16cid="http://schemas.microsoft.com/office/word/2016/wordml/cid" xmlns:w16="http://schemas.microsoft.com/office/word/2018/wordml" xmlns:w16sdtdh="http://schemas.microsoft.com/office/word/2020/wordml/sdtdatahash" xmlns:w16se="http://schemas.microsoft.com/office/word/2015/wordml/symex" xmlns:wpg="http://schemas.microsoft.com/office/word/2010/wordprocessingGroup" xmlns:wpi="http://schemas.microsoft.com/office/word/2010/wordprocessingInk" xmlns:wne="http://schemas.microsoft.com/office/word/2006/wordml" xmlns:wps="http://schemas.microsoft.com/office/word/2010/wordprocessingShape" mc:Ignorable="w14 w15 w16se w16cid w16 w16cex w16sdtdh wp14">
   <w:abstractNum w:abstractNumId="0" w15:restartNumberingAfterBreak="0">
-    <w:nsid w:val="18C61428"/>
+    <w:nsid w:val="032302D3"/>
     <w:multiLevelType w:val="hybridMultilevel"/>
-    <w:tmpl w:val="D49AB162"/>
-    <w:lvl w:ilvl="0" w:tplc="A8A448EA">
-      <w:start w:val="1"/>
-      <w:numFmt w:val="bullet"/>
-      <w:lvlText w:val="●"/>
-      <w:lvlJc w:val="left"/>
-      <w:pPr>
-        <w:ind w:left="720" w:hanging="360"/>
-      </w:pPr>
-    </w:lvl>
-    <w:lvl w:ilvl="1" w:tplc="C010AAA2">
-      <w:start w:val="1"/>
-      <w:numFmt w:val="bullet"/>
-      <w:lvlText w:val="○"/>
-      <w:lvlJc w:val="left"/>
-      <w:pPr>
-        <w:ind w:left="1440" w:hanging="360"/>
-      </w:pPr>
-    </w:lvl>
-    <w:lvl w:ilvl="2" w:tplc="B80C1E5A">
-      <w:start w:val="1"/>
-      <w:numFmt w:val="bullet"/>
-      <w:lvlText w:val="■"/>
-      <w:lvlJc w:val="left"/>
-      <w:pPr>
-        <w:ind w:left="2160" w:hanging="360"/>
-      </w:pPr>
-    </w:lvl>
-    <w:lvl w:ilvl="3" w:tplc="B81C8418">
-      <w:start w:val="1"/>
-      <w:numFmt w:val="bullet"/>
-      <w:lvlText w:val="●"/>
-      <w:lvlJc w:val="left"/>
-      <w:pPr>
-        <w:ind w:left="2880" w:hanging="360"/>
-      </w:pPr>
-    </w:lvl>
-    <w:lvl w:ilvl="4" w:tplc="266430F6">
-      <w:start w:val="1"/>
-      <w:numFmt w:val="bullet"/>
-      <w:lvlText w:val="○"/>
-      <w:lvlJc w:val="left"/>
-      <w:pPr>
-        <w:ind w:left="3600" w:hanging="360"/>
-      </w:pPr>
-    </w:lvl>
-    <w:lvl w:ilvl="5" w:tplc="A6D01426">
-      <w:start w:val="1"/>
-      <w:numFmt w:val="bullet"/>
-      <w:lvlText w:val="■"/>
-      <w:lvlJc w:val="left"/>
-      <w:pPr>
-        <w:ind w:left="4320" w:hanging="360"/>
-      </w:pPr>
-    </w:lvl>
-    <w:lvl w:ilvl="6" w:tplc="4E64E546">
-      <w:start w:val="1"/>
-      <w:numFmt w:val="bullet"/>
-      <w:lvlText w:val="●"/>
-      <w:lvlJc w:val="left"/>
-      <w:pPr>
-        <w:ind w:left="5040" w:hanging="360"/>
-      </w:pPr>
-    </w:lvl>
-    <w:lvl w:ilvl="7" w:tplc="42F63E34">
-      <w:start w:val="1"/>
-      <w:numFmt w:val="bullet"/>
-      <w:lvlText w:val="●"/>
-      <w:lvlJc w:val="left"/>
-      <w:pPr>
-        <w:ind w:left="5760" w:hanging="360"/>
-      </w:pPr>
-    </w:lvl>
-    <w:lvl w:ilvl="8" w:tplc="A68CFD16">
-      <w:start w:val="1"/>
-      <w:numFmt w:val="bullet"/>
-      <w:lvlText w:val="●"/>
-      <w:lvlJc w:val="left"/>
-      <w:pPr>
-        <w:ind w:left="6480" w:hanging="360"/>
-      </w:pPr>
-    </w:lvl>
-  </w:abstractNum>
-  <w:abstractNum w:abstractNumId="1" w15:restartNumberingAfterBreak="0">
-    <w:nsid w:val="27CA31DC"/>
-    <w:multiLevelType w:val="hybridMultilevel"/>
-    <w:tmpl w:val="0F04534A"/>
-    <w:lvl w:ilvl="0" w:tplc="C582B154">
+    <w:tmpl w:val="171CD4C6"/>
+    <w:lvl w:ilvl="0" w:tplc="6B4A5374">
       <w:start w:val="1"/>
       <w:numFmt w:val="bullet"/>
       <w:lvlText w:val="•"/>
@@ -1604,49 +1642,135 @@
         <w:ind w:left="480" w:hanging="240"/>
       </w:pPr>
     </w:lvl>
-    <w:lvl w:ilvl="1" w:tplc="5198B04A">
+    <w:lvl w:ilvl="1" w:tplc="15A0E97C">
       <w:numFmt w:val="decimal"/>
       <w:lvlText w:val=""/>
       <w:lvlJc w:val="left"/>
     </w:lvl>
-    <w:lvl w:ilvl="2" w:tplc="A8F2EEF4">
+    <w:lvl w:ilvl="2" w:tplc="CF08067C">
       <w:numFmt w:val="decimal"/>
       <w:lvlText w:val=""/>
       <w:lvlJc w:val="left"/>
     </w:lvl>
-    <w:lvl w:ilvl="3" w:tplc="B06C8D7A">
+    <w:lvl w:ilvl="3" w:tplc="0CB2584E">
       <w:numFmt w:val="decimal"/>
       <w:lvlText w:val=""/>
       <w:lvlJc w:val="left"/>
     </w:lvl>
-    <w:lvl w:ilvl="4" w:tplc="10A254E8">
+    <w:lvl w:ilvl="4" w:tplc="291679DE">
       <w:numFmt w:val="decimal"/>
       <w:lvlText w:val=""/>
       <w:lvlJc w:val="left"/>
     </w:lvl>
-    <w:lvl w:ilvl="5" w:tplc="9E7A3718">
+    <w:lvl w:ilvl="5" w:tplc="A5229842">
       <w:numFmt w:val="decimal"/>
       <w:lvlText w:val=""/>
       <w:lvlJc w:val="left"/>
     </w:lvl>
-    <w:lvl w:ilvl="6" w:tplc="DC2C3DD8">
+    <w:lvl w:ilvl="6" w:tplc="CB02BEC4">
       <w:numFmt w:val="decimal"/>
       <w:lvlText w:val=""/>
       <w:lvlJc w:val="left"/>
     </w:lvl>
-    <w:lvl w:ilvl="7" w:tplc="0372A60A">
+    <w:lvl w:ilvl="7" w:tplc="0476A614">
       <w:numFmt w:val="decimal"/>
       <w:lvlText w:val=""/>
       <w:lvlJc w:val="left"/>
     </w:lvl>
-    <w:lvl w:ilvl="8" w:tplc="53A6836A">
+    <w:lvl w:ilvl="8" w:tplc="CEA4EA24">
       <w:numFmt w:val="decimal"/>
       <w:lvlText w:val=""/>
       <w:lvlJc w:val="left"/>
     </w:lvl>
   </w:abstractNum>
-  <w:num w:numId="1" w16cid:durableId="902641899">
-    <w:abstractNumId w:val="0"/>
+  <w:abstractNum w:abstractNumId="1" w15:restartNumberingAfterBreak="0">
+    <w:nsid w:val="3B723CD8"/>
+    <w:multiLevelType w:val="hybridMultilevel"/>
+    <w:tmpl w:val="B83ED610"/>
+    <w:lvl w:ilvl="0" w:tplc="AB02FE7A">
+      <w:start w:val="1"/>
+      <w:numFmt w:val="bullet"/>
+      <w:lvlText w:val="●"/>
+      <w:lvlJc w:val="left"/>
+      <w:pPr>
+        <w:ind w:left="720" w:hanging="360"/>
+      </w:pPr>
+    </w:lvl>
+    <w:lvl w:ilvl="1" w:tplc="29E8F2AA">
+      <w:start w:val="1"/>
+      <w:numFmt w:val="bullet"/>
+      <w:lvlText w:val="○"/>
+      <w:lvlJc w:val="left"/>
+      <w:pPr>
+        <w:ind w:left="1440" w:hanging="360"/>
+      </w:pPr>
+    </w:lvl>
+    <w:lvl w:ilvl="2" w:tplc="168ECC56">
+      <w:start w:val="1"/>
+      <w:numFmt w:val="bullet"/>
+      <w:lvlText w:val="■"/>
+      <w:lvlJc w:val="left"/>
+      <w:pPr>
+        <w:ind w:left="2160" w:hanging="360"/>
+      </w:pPr>
+    </w:lvl>
+    <w:lvl w:ilvl="3" w:tplc="73B4572E">
+      <w:start w:val="1"/>
+      <w:numFmt w:val="bullet"/>
+      <w:lvlText w:val="●"/>
+      <w:lvlJc w:val="left"/>
+      <w:pPr>
+        <w:ind w:left="2880" w:hanging="360"/>
+      </w:pPr>
+    </w:lvl>
+    <w:lvl w:ilvl="4" w:tplc="E910CA60">
+      <w:start w:val="1"/>
+      <w:numFmt w:val="bullet"/>
+      <w:lvlText w:val="○"/>
+      <w:lvlJc w:val="left"/>
+      <w:pPr>
+        <w:ind w:left="3600" w:hanging="360"/>
+      </w:pPr>
+    </w:lvl>
+    <w:lvl w:ilvl="5" w:tplc="3D6E3978">
+      <w:start w:val="1"/>
+      <w:numFmt w:val="bullet"/>
+      <w:lvlText w:val="■"/>
+      <w:lvlJc w:val="left"/>
+      <w:pPr>
+        <w:ind w:left="4320" w:hanging="360"/>
+      </w:pPr>
+    </w:lvl>
+    <w:lvl w:ilvl="6" w:tplc="1A5223B0">
+      <w:start w:val="1"/>
+      <w:numFmt w:val="bullet"/>
+      <w:lvlText w:val="●"/>
+      <w:lvlJc w:val="left"/>
+      <w:pPr>
+        <w:ind w:left="5040" w:hanging="360"/>
+      </w:pPr>
+    </w:lvl>
+    <w:lvl w:ilvl="7" w:tplc="6914C2EA">
+      <w:start w:val="1"/>
+      <w:numFmt w:val="bullet"/>
+      <w:lvlText w:val="●"/>
+      <w:lvlJc w:val="left"/>
+      <w:pPr>
+        <w:ind w:left="5760" w:hanging="360"/>
+      </w:pPr>
+    </w:lvl>
+    <w:lvl w:ilvl="8" w:tplc="40BE434E">
+      <w:start w:val="1"/>
+      <w:numFmt w:val="bullet"/>
+      <w:lvlText w:val="●"/>
+      <w:lvlJc w:val="left"/>
+      <w:pPr>
+        <w:ind w:left="6480" w:hanging="360"/>
+      </w:pPr>
+    </w:lvl>
+  </w:abstractNum>
+  <w:num w:numId="1" w16cid:durableId="1157646380">
+    <w:abstractNumId w:val="1"/>
     <w:lvlOverride w:ilvl="0">
       <w:startOverride w:val="1"/>
     </w:lvlOverride>

</xml_diff>

<commit_message>
Srs User Story Table Added
</commit_message>
<xml_diff>
--- a/CampusXchange_SRS.docx
+++ b/CampusXchange_SRS.docx
@@ -12,7 +12,7 @@
           <w:noProof/>
         </w:rPr>
         <w:drawing>
-          <wp:inline distT="0" distB="0" distL="0" distR="0" wp14:anchorId="7E10A7DD" wp14:editId="6004B27C">
+          <wp:inline distT="0" distB="0" distL="0" distR="0" wp14:anchorId="009ECD3A" wp14:editId="6733DBE5">
             <wp:extent cx="857250" cy="857250"/>
             <wp:effectExtent l="0" t="0" r="0" b="0"/>
             <wp:docPr id="1" name="Picture 1"/>
@@ -133,20 +133,52 @@
           <w:b/>
           <w:bCs/>
         </w:rPr>
-        <w:t>Section: P</w:t>
-      </w:r>
-    </w:p>
-    <w:p>
-      <w:pPr>
-        <w:spacing w:after="60"/>
-        <w:jc w:val="center"/>
-      </w:pPr>
+        <w:t>Section: [</w:t>
+      </w:r>
+      <w:proofErr w:type="spellStart"/>
       <w:r>
         <w:rPr>
           <w:b/>
           <w:bCs/>
         </w:rPr>
-        <w:t>Group No: 8</w:t>
+        <w:t>edit_here</w:t>
+      </w:r>
+      <w:proofErr w:type="spellEnd"/>
+      <w:r>
+        <w:rPr>
+          <w:b/>
+          <w:bCs/>
+        </w:rPr>
+        <w:t>]</w:t>
+      </w:r>
+    </w:p>
+    <w:p>
+      <w:pPr>
+        <w:spacing w:after="60"/>
+        <w:jc w:val="center"/>
+      </w:pPr>
+      <w:r>
+        <w:rPr>
+          <w:b/>
+          <w:bCs/>
+        </w:rPr>
+        <w:t>Group No: ** [</w:t>
+      </w:r>
+      <w:proofErr w:type="spellStart"/>
+      <w:r>
+        <w:rPr>
+          <w:b/>
+          <w:bCs/>
+        </w:rPr>
+        <w:t>edit_here</w:t>
+      </w:r>
+      <w:proofErr w:type="spellEnd"/>
+      <w:r>
+        <w:rPr>
+          <w:b/>
+          <w:bCs/>
+        </w:rPr>
+        <w:t>]</w:t>
       </w:r>
     </w:p>
     <w:p>
@@ -225,7 +257,7 @@
         <w:jc w:val="center"/>
       </w:pPr>
       <w:r>
-        <w:t>Mahmudul Hasan</w:t>
+        <w:t>[Instructor Name]</w:t>
       </w:r>
     </w:p>
     <w:p>
@@ -352,13 +384,20 @@
             <w:vAlign w:val="center"/>
           </w:tcPr>
           <w:p>
+            <w:r>
+              <w:rPr>
+                <w:sz w:val="22"/>
+                <w:szCs w:val="22"/>
+              </w:rPr>
+              <w:t>[</w:t>
+            </w:r>
             <w:proofErr w:type="spellStart"/>
             <w:r>
               <w:rPr>
                 <w:sz w:val="22"/>
                 <w:szCs w:val="22"/>
               </w:rPr>
-              <w:t>Yeasin</w:t>
+              <w:t>edit_here</w:t>
             </w:r>
             <w:proofErr w:type="spellEnd"/>
             <w:r>
@@ -366,7 +405,7 @@
                 <w:sz w:val="22"/>
                 <w:szCs w:val="22"/>
               </w:rPr>
-              <w:t xml:space="preserve"> Arafat Prantik</w:t>
+              <w:t>]</w:t>
             </w:r>
           </w:p>
         </w:tc>
@@ -381,7 +420,23 @@
                 <w:sz w:val="22"/>
                 <w:szCs w:val="22"/>
               </w:rPr>
-              <w:t>23-53115-3</w:t>
+              <w:t>[</w:t>
+            </w:r>
+            <w:proofErr w:type="spellStart"/>
+            <w:r>
+              <w:rPr>
+                <w:sz w:val="22"/>
+                <w:szCs w:val="22"/>
+              </w:rPr>
+              <w:t>edit_here</w:t>
+            </w:r>
+            <w:proofErr w:type="spellEnd"/>
+            <w:r>
+              <w:rPr>
+                <w:sz w:val="22"/>
+                <w:szCs w:val="22"/>
+              </w:rPr>
+              <w:t>]</w:t>
             </w:r>
           </w:p>
         </w:tc>
@@ -416,13 +471,20 @@
             <w:vAlign w:val="center"/>
           </w:tcPr>
           <w:p>
+            <w:r>
+              <w:rPr>
+                <w:sz w:val="22"/>
+                <w:szCs w:val="22"/>
+              </w:rPr>
+              <w:t>[</w:t>
+            </w:r>
             <w:proofErr w:type="spellStart"/>
             <w:r>
               <w:rPr>
                 <w:sz w:val="22"/>
                 <w:szCs w:val="22"/>
               </w:rPr>
-              <w:t>Imamul</w:t>
+              <w:t>edit_here</w:t>
             </w:r>
             <w:proofErr w:type="spellEnd"/>
             <w:r>
@@ -430,7 +492,7 @@
                 <w:sz w:val="22"/>
                 <w:szCs w:val="22"/>
               </w:rPr>
-              <w:t xml:space="preserve"> Islam Shihab</w:t>
+              <w:t>]</w:t>
             </w:r>
           </w:p>
         </w:tc>
@@ -445,7 +507,23 @@
                 <w:sz w:val="22"/>
                 <w:szCs w:val="22"/>
               </w:rPr>
-              <w:t>23-53114-3</w:t>
+              <w:t>[</w:t>
+            </w:r>
+            <w:proofErr w:type="spellStart"/>
+            <w:r>
+              <w:rPr>
+                <w:sz w:val="22"/>
+                <w:szCs w:val="22"/>
+              </w:rPr>
+              <w:t>edit_here</w:t>
+            </w:r>
+            <w:proofErr w:type="spellEnd"/>
+            <w:r>
+              <w:rPr>
+                <w:sz w:val="22"/>
+                <w:szCs w:val="22"/>
+              </w:rPr>
+              <w:t>]</w:t>
             </w:r>
           </w:p>
         </w:tc>
@@ -480,13 +558,20 @@
             <w:vAlign w:val="center"/>
           </w:tcPr>
           <w:p>
+            <w:r>
+              <w:rPr>
+                <w:sz w:val="22"/>
+                <w:szCs w:val="22"/>
+              </w:rPr>
+              <w:t>[</w:t>
+            </w:r>
             <w:proofErr w:type="spellStart"/>
             <w:r>
               <w:rPr>
                 <w:sz w:val="22"/>
                 <w:szCs w:val="22"/>
               </w:rPr>
-              <w:t>Meherab</w:t>
+              <w:t>edit_here</w:t>
             </w:r>
             <w:proofErr w:type="spellEnd"/>
             <w:r>
@@ -494,7 +579,22 @@
                 <w:sz w:val="22"/>
                 <w:szCs w:val="22"/>
               </w:rPr>
-              <w:t xml:space="preserve"> Hossain </w:t>
+              <w:t>]</w:t>
+            </w:r>
+          </w:p>
+        </w:tc>
+        <w:tc>
+          <w:tcPr>
+            <w:tcW w:w="3360" w:type="dxa"/>
+            <w:vAlign w:val="center"/>
+          </w:tcPr>
+          <w:p>
+            <w:r>
+              <w:rPr>
+                <w:sz w:val="22"/>
+                <w:szCs w:val="22"/>
+              </w:rPr>
+              <w:t>[</w:t>
             </w:r>
             <w:proofErr w:type="spellStart"/>
             <w:r>
@@ -502,23 +602,15 @@
                 <w:sz w:val="22"/>
                 <w:szCs w:val="22"/>
               </w:rPr>
-              <w:t>Emon</w:t>
+              <w:t>edit_here</w:t>
             </w:r>
             <w:proofErr w:type="spellEnd"/>
-          </w:p>
-        </w:tc>
-        <w:tc>
-          <w:tcPr>
-            <w:tcW w:w="3360" w:type="dxa"/>
-            <w:vAlign w:val="center"/>
-          </w:tcPr>
-          <w:p>
-            <w:r>
-              <w:rPr>
-                <w:sz w:val="22"/>
-                <w:szCs w:val="22"/>
-              </w:rPr>
-              <w:t>23-53218-3</w:t>
+            <w:r>
+              <w:rPr>
+                <w:sz w:val="22"/>
+                <w:szCs w:val="22"/>
+              </w:rPr>
+              <w:t>]</w:t>
             </w:r>
           </w:p>
         </w:tc>
@@ -553,13 +645,20 @@
             <w:vAlign w:val="center"/>
           </w:tcPr>
           <w:p>
+            <w:r>
+              <w:rPr>
+                <w:sz w:val="22"/>
+                <w:szCs w:val="22"/>
+              </w:rPr>
+              <w:t>[</w:t>
+            </w:r>
             <w:proofErr w:type="spellStart"/>
             <w:r>
               <w:rPr>
                 <w:sz w:val="22"/>
                 <w:szCs w:val="22"/>
               </w:rPr>
-              <w:t>Fardin</w:t>
+              <w:t>edit_here</w:t>
             </w:r>
             <w:proofErr w:type="spellEnd"/>
             <w:r>
@@ -567,7 +666,7 @@
                 <w:sz w:val="22"/>
                 <w:szCs w:val="22"/>
               </w:rPr>
-              <w:t xml:space="preserve"> Haque</w:t>
+              <w:t>]</w:t>
             </w:r>
           </w:p>
         </w:tc>
@@ -582,7 +681,110 @@
                 <w:sz w:val="22"/>
                 <w:szCs w:val="22"/>
               </w:rPr>
-              <w:t>23-53274-3</w:t>
+              <w:t>[</w:t>
+            </w:r>
+            <w:proofErr w:type="spellStart"/>
+            <w:r>
+              <w:rPr>
+                <w:sz w:val="22"/>
+                <w:szCs w:val="22"/>
+              </w:rPr>
+              <w:t>edit_here</w:t>
+            </w:r>
+            <w:proofErr w:type="spellEnd"/>
+            <w:r>
+              <w:rPr>
+                <w:sz w:val="22"/>
+                <w:szCs w:val="22"/>
+              </w:rPr>
+              <w:t>]</w:t>
+            </w:r>
+          </w:p>
+        </w:tc>
+      </w:tr>
+      <w:tr>
+        <w:tblPrEx>
+          <w:tblCellMar>
+            <w:top w:w="0" w:type="dxa"/>
+            <w:bottom w:w="0" w:type="dxa"/>
+          </w:tblCellMar>
+        </w:tblPrEx>
+        <w:tc>
+          <w:tcPr>
+            <w:tcW w:w="900" w:type="dxa"/>
+            <w:vAlign w:val="center"/>
+          </w:tcPr>
+          <w:p>
+            <w:r>
+              <w:rPr>
+                <w:b/>
+                <w:bCs/>
+                <w:sz w:val="22"/>
+                <w:szCs w:val="22"/>
+              </w:rPr>
+              <w:t>5.</w:t>
+            </w:r>
+          </w:p>
+        </w:tc>
+        <w:tc>
+          <w:tcPr>
+            <w:tcW w:w="5100" w:type="dxa"/>
+            <w:vAlign w:val="center"/>
+          </w:tcPr>
+          <w:p>
+            <w:r>
+              <w:rPr>
+                <w:sz w:val="22"/>
+                <w:szCs w:val="22"/>
+              </w:rPr>
+              <w:t>[</w:t>
+            </w:r>
+            <w:proofErr w:type="spellStart"/>
+            <w:r>
+              <w:rPr>
+                <w:sz w:val="22"/>
+                <w:szCs w:val="22"/>
+              </w:rPr>
+              <w:t>edit_here</w:t>
+            </w:r>
+            <w:proofErr w:type="spellEnd"/>
+            <w:r>
+              <w:rPr>
+                <w:sz w:val="22"/>
+                <w:szCs w:val="22"/>
+              </w:rPr>
+              <w:t>]</w:t>
+            </w:r>
+          </w:p>
+        </w:tc>
+        <w:tc>
+          <w:tcPr>
+            <w:tcW w:w="3360" w:type="dxa"/>
+            <w:vAlign w:val="center"/>
+          </w:tcPr>
+          <w:p>
+            <w:r>
+              <w:rPr>
+                <w:sz w:val="22"/>
+                <w:szCs w:val="22"/>
+              </w:rPr>
+              <w:t>[</w:t>
+            </w:r>
+            <w:proofErr w:type="spellStart"/>
+            <w:r>
+              <w:rPr>
+                <w:sz w:val="22"/>
+                <w:szCs w:val="22"/>
+              </w:rPr>
+              <w:t>edit_here</w:t>
+            </w:r>
+            <w:proofErr w:type="spellEnd"/>
+            <w:r>
+              <w:rPr>
+                <w:sz w:val="22"/>
+                <w:szCs w:val="22"/>
+              </w:rPr>
+              <w:t>]</w:t>
             </w:r>
           </w:p>
         </w:tc>
@@ -852,41 +1054,7 @@
         <w:jc w:val="both"/>
       </w:pPr>
       <w:r>
-        <w:t xml:space="preserve">Over the past two decades, online peer-to-peer marketplaces have changed the way second-hand goods are bought and sold. General-purpose platforms such as eBay, Craigslist, Facebook Marketplace, and regional services such as </w:t>
-      </w:r>
-      <w:proofErr w:type="spellStart"/>
-      <w:r>
-        <w:t>Bikroy</w:t>
-      </w:r>
-      <w:proofErr w:type="spellEnd"/>
-      <w:r>
-        <w:t xml:space="preserve"> and OLX have made it ordinary for individuals to trade directly with one another instead of going through a retailer. Because these platforms are open to the </w:t>
-      </w:r>
-      <w:proofErr w:type="gramStart"/>
-      <w:r>
-        <w:t>general public</w:t>
-      </w:r>
-      <w:proofErr w:type="gramEnd"/>
-      <w:r>
-        <w:t>, buyers and sellers are usually complete strangers, and the platforms therefore depend on payment escrow, public reputation scores, and dedicated dispute-resolution teams to establish the trust that the transaction itself does not provide.</w:t>
-      </w:r>
-    </w:p>
-    <w:p>
-      <w:pPr>
-        <w:spacing w:after="160"/>
-        <w:jc w:val="both"/>
-      </w:pPr>
-      <w:r>
-        <w:t>A university campus is a fundamentally different trading environment. It is a closed community whose members share a single physical location, a common academic calendar, and a verifiable institutional identity in the form of a university email address. Demand within this community is also highly predictable and seasonal: textbooks change hands at the beginning and end of every semester, while dormitory furniture, appliances, bicycles, and electronics circulate as students move in, graduate, or relocate. These conditions make a campus an unusually good fit for a resale marketplace, since the members are already partially trusted and meeting in person costs almost nothing. Despite this, most universities provide no dedicated tool for such exchanges.</w:t>
-      </w:r>
-    </w:p>
-    <w:p>
-      <w:pPr>
-        <w:spacing w:after="160"/>
-        <w:jc w:val="both"/>
-      </w:pPr>
-      <w:r>
-        <w:t xml:space="preserve">In the absence of such a tool, students at most universities buy, sell, and trade used textbooks, dorm furniture, electronics, and personal items informally through scattered Facebook groups, WhatsApp chats, and physical bulletin boards. This process is inefficient, unsafe, and difficult to search or track. </w:t>
+        <w:t xml:space="preserve">Students at most universities buy, sell, and trade used textbooks, dorm furniture, electronics, and personal items informally through scattered Facebook groups, WhatsApp chats, and physical bulletin boards. This process is inefficient, unsafe, and difficult to search or track. </w:t>
       </w:r>
       <w:proofErr w:type="spellStart"/>
       <w:r>
@@ -957,40 +1125,6 @@
     </w:p>
     <w:p>
       <w:pPr>
-        <w:spacing w:after="160"/>
-        <w:jc w:val="both"/>
-      </w:pPr>
-      <w:r>
-        <w:lastRenderedPageBreak/>
-        <w:t xml:space="preserve">The features below are described in terms of the roles that the system </w:t>
-      </w:r>
-      <w:proofErr w:type="spellStart"/>
-      <w:r>
-        <w:t>recognises</w:t>
-      </w:r>
-      <w:proofErr w:type="spellEnd"/>
-      <w:r>
-        <w:t xml:space="preserve">. A Student is any person who has registered with a verified university email address; the same student acts as a Seller for the listings they own and as a Buyer for every other listing, so the two roles are </w:t>
-      </w:r>
-      <w:proofErr w:type="spellStart"/>
-      <w:r>
-        <w:t>behavioural</w:t>
-      </w:r>
-      <w:proofErr w:type="spellEnd"/>
-      <w:r>
-        <w:t xml:space="preserve"> rather than separate accounts. An Administrator is a privileged account provisioned by the system owner to enforce platform policy. The Notification Service is an external system rather than a human </w:t>
-      </w:r>
-      <w:proofErr w:type="gramStart"/>
-      <w:r>
-        <w:t>role, and</w:t>
-      </w:r>
-      <w:proofErr w:type="gramEnd"/>
-      <w:r>
-        <w:t xml:space="preserve"> is included where a feature depends on it.</w:t>
-      </w:r>
-    </w:p>
-    <w:p>
-      <w:pPr>
         <w:pStyle w:val="Heading2"/>
         <w:spacing w:before="240" w:after="120"/>
       </w:pPr>
@@ -1013,57 +1147,6 @@
     </w:p>
     <w:p>
       <w:pPr>
-        <w:spacing w:after="60"/>
-        <w:ind w:left="360"/>
-        <w:jc w:val="both"/>
-      </w:pPr>
-      <w:r>
-        <w:rPr>
-          <w:b/>
-          <w:bCs/>
-        </w:rPr>
-        <w:t xml:space="preserve">Student: </w:t>
-      </w:r>
-      <w:r>
-        <w:t>registers with a university email address, confirms the account through a verification link, logs in and out, maintains a session across visits, and requests a password reset when needed. An account remains unverified, and therefore unable to post or message, until the link is confirmed.</w:t>
-      </w:r>
-    </w:p>
-    <w:p>
-      <w:pPr>
-        <w:spacing w:after="60"/>
-        <w:ind w:left="360"/>
-        <w:jc w:val="both"/>
-      </w:pPr>
-      <w:r>
-        <w:rPr>
-          <w:b/>
-          <w:bCs/>
-        </w:rPr>
-        <w:t xml:space="preserve">Administrator: </w:t>
-      </w:r>
-      <w:r>
-        <w:t>signs in through the same login form but holds an elevated role flag on the account. Administrator accounts are provisioned directly by the system owner and cannot be created through the public registration form.</w:t>
-      </w:r>
-    </w:p>
-    <w:p>
-      <w:pPr>
-        <w:spacing w:after="160"/>
-        <w:ind w:left="360"/>
-        <w:jc w:val="both"/>
-      </w:pPr>
-      <w:r>
-        <w:rPr>
-          <w:b/>
-          <w:bCs/>
-        </w:rPr>
-        <w:t xml:space="preserve">Notification Service: </w:t>
-      </w:r>
-      <w:r>
-        <w:t>delivers the verification and password-reset emails on the system's behalf.</w:t>
-      </w:r>
-    </w:p>
-    <w:p>
-      <w:pPr>
         <w:pStyle w:val="Heading2"/>
         <w:spacing w:before="240" w:after="120"/>
       </w:pPr>
@@ -1086,73 +1169,6 @@
     </w:p>
     <w:p>
       <w:pPr>
-        <w:spacing w:after="60"/>
-        <w:ind w:left="360"/>
-        <w:jc w:val="both"/>
-      </w:pPr>
-      <w:r>
-        <w:rPr>
-          <w:b/>
-          <w:bCs/>
-        </w:rPr>
-        <w:t xml:space="preserve">Seller: </w:t>
-      </w:r>
-      <w:r>
-        <w:t xml:space="preserve">creates a listing, uploads up to five photographs, edits any field while the listing is active, marks it </w:t>
-      </w:r>
-      <w:proofErr w:type="spellStart"/>
-      <w:r>
-        <w:t>as</w:t>
-      </w:r>
-      <w:proofErr w:type="spellEnd"/>
-      <w:r>
-        <w:t xml:space="preserve"> sold once the transaction is complete, and deletes it. These actions are restricted to listings the seller owns.</w:t>
-      </w:r>
-    </w:p>
-    <w:p>
-      <w:pPr>
-        <w:spacing w:after="60"/>
-        <w:ind w:left="360"/>
-        <w:jc w:val="both"/>
-      </w:pPr>
-      <w:r>
-        <w:rPr>
-          <w:b/>
-          <w:bCs/>
-        </w:rPr>
-        <w:t xml:space="preserve">Buyer: </w:t>
-      </w:r>
-      <w:r>
-        <w:t xml:space="preserve">views the full detail of any active listing and reports one that appears fraudulent or violates platform </w:t>
-      </w:r>
-      <w:proofErr w:type="gramStart"/>
-      <w:r>
-        <w:t>rules, but</w:t>
-      </w:r>
-      <w:proofErr w:type="gramEnd"/>
-      <w:r>
-        <w:t xml:space="preserve"> cannot alter another user's listing in any way.</w:t>
-      </w:r>
-    </w:p>
-    <w:p>
-      <w:pPr>
-        <w:spacing w:after="160"/>
-        <w:ind w:left="360"/>
-        <w:jc w:val="both"/>
-      </w:pPr>
-      <w:r>
-        <w:rPr>
-          <w:b/>
-          <w:bCs/>
-        </w:rPr>
-        <w:t xml:space="preserve">Administrator: </w:t>
-      </w:r>
-      <w:r>
-        <w:t>views every listing, including those already sold or removed, and takes a violating listing down. An administrator removes content but does not edit it, so the original text is preserved for the moderation record.</w:t>
-      </w:r>
-    </w:p>
-    <w:p>
-      <w:pPr>
         <w:pStyle w:val="Heading2"/>
         <w:spacing w:before="240" w:after="120"/>
       </w:pPr>
@@ -1175,74 +1191,6 @@
     </w:p>
     <w:p>
       <w:pPr>
-        <w:spacing w:after="60"/>
-        <w:ind w:left="360"/>
-        <w:jc w:val="both"/>
-      </w:pPr>
-      <w:r>
-        <w:rPr>
-          <w:b/>
-          <w:bCs/>
-        </w:rPr>
-        <w:t xml:space="preserve">Buyer: </w:t>
-      </w:r>
-      <w:r>
-        <w:t>searches active listings by keyword, narrows the results by category, price range, and item condition, sorts them by recency or price, and opens a seller's profile to check their rating before making contact.</w:t>
-      </w:r>
-    </w:p>
-    <w:p>
-      <w:pPr>
-        <w:spacing w:after="60"/>
-        <w:ind w:left="360"/>
-        <w:jc w:val="both"/>
-      </w:pPr>
-      <w:r>
-        <w:rPr>
-          <w:b/>
-          <w:bCs/>
-        </w:rPr>
-        <w:t xml:space="preserve">Seller: </w:t>
-      </w:r>
-      <w:r>
-        <w:t xml:space="preserve">has the same search access as any other student, and additionally sees a private dashboard of their own listings with the </w:t>
-      </w:r>
-      <w:proofErr w:type="gramStart"/>
-      <w:r>
-        <w:t>current status</w:t>
-      </w:r>
-      <w:proofErr w:type="gramEnd"/>
-      <w:r>
-        <w:t xml:space="preserve"> of each one.</w:t>
-      </w:r>
-    </w:p>
-    <w:p>
-      <w:pPr>
-        <w:spacing w:after="160"/>
-        <w:ind w:left="360"/>
-        <w:jc w:val="both"/>
-      </w:pPr>
-      <w:r>
-        <w:rPr>
-          <w:b/>
-          <w:bCs/>
-        </w:rPr>
-        <w:lastRenderedPageBreak/>
-        <w:t xml:space="preserve">Administrator: </w:t>
-      </w:r>
-      <w:r>
-        <w:t xml:space="preserve">searches across all listings regardless of </w:t>
-      </w:r>
-      <w:proofErr w:type="gramStart"/>
-      <w:r>
-        <w:t>status, and</w:t>
-      </w:r>
-      <w:proofErr w:type="gramEnd"/>
-      <w:r>
-        <w:t xml:space="preserve"> can filter specifically for listings that have been reported.</w:t>
-      </w:r>
-    </w:p>
-    <w:p>
-      <w:pPr>
         <w:pStyle w:val="Heading2"/>
         <w:spacing w:before="240" w:after="120"/>
       </w:pPr>
@@ -1260,75 +1208,8 @@
         <w:jc w:val="both"/>
       </w:pPr>
       <w:r>
+        <w:lastRenderedPageBreak/>
         <w:t>Buyers and sellers can communicate directly within the platform about a specific listing without exchanging personal contact information, reducing safety and privacy concerns.</w:t>
-      </w:r>
-    </w:p>
-    <w:p>
-      <w:pPr>
-        <w:spacing w:after="60"/>
-        <w:ind w:left="360"/>
-        <w:jc w:val="both"/>
-      </w:pPr>
-      <w:r>
-        <w:rPr>
-          <w:b/>
-          <w:bCs/>
-        </w:rPr>
-        <w:t xml:space="preserve">Buyer: </w:t>
-      </w:r>
-      <w:r>
-        <w:t>starts a conversation from a listing page. Every conversation is tied to the listing that prompted it, so the context of an enquiry is never lost.</w:t>
-      </w:r>
-    </w:p>
-    <w:p>
-      <w:pPr>
-        <w:spacing w:after="60"/>
-        <w:ind w:left="360"/>
-        <w:jc w:val="both"/>
-      </w:pPr>
-      <w:r>
-        <w:rPr>
-          <w:b/>
-          <w:bCs/>
-        </w:rPr>
-        <w:t xml:space="preserve">Seller: </w:t>
-      </w:r>
-      <w:r>
-        <w:t>replies within the same thread and sees all conversations grouped by listing. Neither party is shown the other's email address or phone number at any point.</w:t>
-      </w:r>
-    </w:p>
-    <w:p>
-      <w:pPr>
-        <w:spacing w:after="60"/>
-        <w:ind w:left="360"/>
-        <w:jc w:val="both"/>
-      </w:pPr>
-      <w:r>
-        <w:rPr>
-          <w:b/>
-          <w:bCs/>
-        </w:rPr>
-        <w:t xml:space="preserve">Administrator: </w:t>
-      </w:r>
-      <w:r>
-        <w:t>has no access to private conversations during normal operation. Message content becomes visible only for a thread that a participant has explicitly reported, and only for the purpose of resolving that report.</w:t>
-      </w:r>
-    </w:p>
-    <w:p>
-      <w:pPr>
-        <w:spacing w:after="160"/>
-        <w:ind w:left="360"/>
-        <w:jc w:val="both"/>
-      </w:pPr>
-      <w:r>
-        <w:rPr>
-          <w:b/>
-          <w:bCs/>
-        </w:rPr>
-        <w:t xml:space="preserve">Notification Service: </w:t>
-      </w:r>
-      <w:r>
-        <w:t>alerts the recipient that a new message is waiting.</w:t>
       </w:r>
     </w:p>
     <w:p>
@@ -1355,65 +1236,6 @@
     </w:p>
     <w:p>
       <w:pPr>
-        <w:spacing w:after="60"/>
-        <w:ind w:left="360"/>
-        <w:jc w:val="both"/>
-      </w:pPr>
-      <w:r>
-        <w:rPr>
-          <w:b/>
-          <w:bCs/>
-        </w:rPr>
-        <w:t xml:space="preserve">Buyer and Seller: </w:t>
-      </w:r>
-      <w:r>
-        <w:t>each submit one rating and one short review of the other party per completed transaction. A rating can only be left once the listing has been marked as sold, which prevents reviews from accounts that never traded.</w:t>
-      </w:r>
-    </w:p>
-    <w:p>
-      <w:pPr>
-        <w:spacing w:after="60"/>
-        <w:ind w:left="360"/>
-        <w:jc w:val="both"/>
-      </w:pPr>
-      <w:r>
-        <w:rPr>
-          <w:b/>
-          <w:bCs/>
-        </w:rPr>
-        <w:t xml:space="preserve">Student: </w:t>
-      </w:r>
-      <w:r>
-        <w:t xml:space="preserve">views the aggregate score and individual reviews on any public </w:t>
-      </w:r>
-      <w:proofErr w:type="gramStart"/>
-      <w:r>
-        <w:t>profile, but</w:t>
-      </w:r>
-      <w:proofErr w:type="gramEnd"/>
-      <w:r>
-        <w:t xml:space="preserve"> cannot see who rated whom outside their own transactions.</w:t>
-      </w:r>
-    </w:p>
-    <w:p>
-      <w:pPr>
-        <w:spacing w:after="160"/>
-        <w:ind w:left="360"/>
-        <w:jc w:val="both"/>
-      </w:pPr>
-      <w:r>
-        <w:rPr>
-          <w:b/>
-          <w:bCs/>
-        </w:rPr>
-        <w:t xml:space="preserve">Administrator: </w:t>
-      </w:r>
-      <w:r>
-        <w:t>removes a review containing abusive or irrelevant content; the aggregate score is recalculated once the review is removed.</w:t>
-      </w:r>
-    </w:p>
-    <w:p>
-      <w:pPr>
         <w:pStyle w:val="Heading2"/>
         <w:spacing w:before="240" w:after="120"/>
       </w:pPr>
@@ -1432,65 +1254,6 @@
       </w:pPr>
       <w:r>
         <w:t>Designated administrators can review reported listings, remove content that violates platform rules, and suspend accounts that repeatedly violate policy.</w:t>
-      </w:r>
-    </w:p>
-    <w:p>
-      <w:pPr>
-        <w:spacing w:after="60"/>
-        <w:ind w:left="360"/>
-        <w:jc w:val="both"/>
-      </w:pPr>
-      <w:r>
-        <w:rPr>
-          <w:b/>
-          <w:bCs/>
-        </w:rPr>
-        <w:t xml:space="preserve">Student: </w:t>
-      </w:r>
-      <w:r>
-        <w:t>reports a listing, a user, or a message thread, selecting a reason from a fixed list. A student cannot see the outcome of another user's report.</w:t>
-      </w:r>
-    </w:p>
-    <w:p>
-      <w:pPr>
-        <w:spacing w:after="60"/>
-        <w:ind w:left="360"/>
-        <w:jc w:val="both"/>
-      </w:pPr>
-      <w:r>
-        <w:rPr>
-          <w:b/>
-          <w:bCs/>
-        </w:rPr>
-        <w:t xml:space="preserve">Administrator: </w:t>
-      </w:r>
-      <w:r>
-        <w:t>works through a queue of reported content, removes listings that breach the rules, suspends and later reinstates accounts, and reviews a history of past moderation actions. Suspension blocks login, posting, and messaging while leaving the account's data intact.</w:t>
-      </w:r>
-    </w:p>
-    <w:p>
-      <w:pPr>
-        <w:spacing w:after="160"/>
-        <w:ind w:left="360"/>
-        <w:jc w:val="both"/>
-      </w:pPr>
-      <w:r>
-        <w:rPr>
-          <w:b/>
-          <w:bCs/>
-        </w:rPr>
-        <w:t xml:space="preserve">Notification Service: </w:t>
-      </w:r>
-      <w:r>
-        <w:t xml:space="preserve">informs the affected user that their listing was </w:t>
-      </w:r>
-      <w:proofErr w:type="gramStart"/>
-      <w:r>
-        <w:t>removed</w:t>
-      </w:r>
-      <w:proofErr w:type="gramEnd"/>
-      <w:r>
-        <w:t xml:space="preserve"> or their account suspended, together with the reason recorded by the administrator.</w:t>
       </w:r>
     </w:p>
     <w:p>
@@ -1517,10 +1280,9 @@
         <w:rPr>
           <w:noProof/>
         </w:rPr>
-        <w:lastRenderedPageBreak/>
         <w:drawing>
-          <wp:inline distT="0" distB="0" distL="0" distR="0" wp14:anchorId="2F4019C9" wp14:editId="492A0C96">
-            <wp:extent cx="5760720" cy="4367320"/>
+          <wp:inline distT="0" distB="0" distL="0" distR="0" wp14:anchorId="4B87D861" wp14:editId="3584CDAB">
+            <wp:extent cx="5334000" cy="4610100"/>
             <wp:effectExtent l="0" t="0" r="0" b="0"/>
             <wp:docPr id="2" name="Picture 2"/>
             <wp:cNvGraphicFramePr>
@@ -1545,7 +1307,7 @@
                   <pic:spPr bwMode="auto">
                     <a:xfrm>
                       <a:off x="0" y="0"/>
-                      <a:ext cx="5760720" cy="4367320"/>
+                      <a:ext cx="5334000" cy="4610100"/>
                     </a:xfrm>
                     <a:prstGeom prst="rect">
                       <a:avLst/>
@@ -1606,7 +1368,7 @@
       </w:r>
       <w:proofErr w:type="gramEnd"/>
       <w:r>
-        <w:t xml:space="preserve">, who acts as both buyer and seller; the Administrator; and the Notification Service. The Notification Service is not a person but an external system that the application depends on, so it is drawn as a stereotyped box rather than a stick figure. A Student registers and logs in, which includes verifying their university email address before access is granted. Once authenticated, a </w:t>
+        <w:t xml:space="preserve"> (acting as both buyer and seller), the Administrator, and an external Notification Service. A Student registers and logs in, which includes verifying their university email address before access is granted. Once authenticated, a </w:t>
       </w:r>
       <w:proofErr w:type="gramStart"/>
       <w:r>
@@ -1614,8 +1376,1437 @@
       </w:r>
       <w:proofErr w:type="gramEnd"/>
       <w:r>
-        <w:t xml:space="preserve"> can create, edit, or delete listings; search and filter listings posted by others; message another student about a specific listing; mark an item as sold once a transaction is complete; and rate the counterparty afterwards. The Administrator suspends user accounts and moderates or removes listings that violate platform policy. Three use cases depend on the Notification Service and are therefore linked to Send Notification by an «include» relationship: messaging a buyer or seller alerts the recipient, while suspending an account or removing a listing informs the affected user of the action and its recorded reason.</w:t>
-      </w:r>
+        <w:t xml:space="preserve"> can create, edit, or delete listings; search and filter listings posted by others; message another student about a specific listing; mark an item as sold </w:t>
+      </w:r>
+      <w:r>
+        <w:lastRenderedPageBreak/>
+        <w:t>once a transaction is complete; and rate the counterparty after the transaction. The Message Buyer/Seller use case includes sending a notification, handled through the external Notification Service, to alert the recipient of a new message. The Administrator interacts with the system to suspend user accounts and to moderate or remove listings that violate platform policy; moderation actions also trigger a notification to the affected user through the same Notification Service.</w:t>
+      </w:r>
+    </w:p>
+    <w:p>
+      <w:pPr>
+        <w:pStyle w:val="Heading1"/>
+        <w:spacing w:before="360" w:after="180"/>
+      </w:pPr>
+      <w:r>
+        <w:rPr>
+          <w:b/>
+          <w:bCs/>
+          <w:sz w:val="30"/>
+          <w:szCs w:val="30"/>
+        </w:rPr>
+        <w:t>4. USER STORY TABLE</w:t>
+      </w:r>
+    </w:p>
+    <w:tbl>
+      <w:tblPr>
+        <w:tblW w:w="9360" w:type="dxa"/>
+        <w:tblBorders>
+          <w:top w:val="single" w:sz="4" w:space="0" w:color="auto"/>
+          <w:left w:val="single" w:sz="4" w:space="0" w:color="auto"/>
+          <w:bottom w:val="single" w:sz="4" w:space="0" w:color="auto"/>
+          <w:right w:val="single" w:sz="4" w:space="0" w:color="auto"/>
+          <w:insideH w:val="single" w:sz="4" w:space="0" w:color="auto"/>
+          <w:insideV w:val="single" w:sz="4" w:space="0" w:color="auto"/>
+        </w:tblBorders>
+        <w:tblCellMar>
+          <w:left w:w="10" w:type="dxa"/>
+          <w:right w:w="10" w:type="dxa"/>
+        </w:tblCellMar>
+        <w:tblLook w:val="0000" w:firstRow="0" w:lastRow="0" w:firstColumn="0" w:lastColumn="0" w:noHBand="0" w:noVBand="0"/>
+      </w:tblPr>
+      <w:tblGrid>
+        <w:gridCol w:w="788"/>
+        <w:gridCol w:w="1924"/>
+        <w:gridCol w:w="2799"/>
+        <w:gridCol w:w="2799"/>
+        <w:gridCol w:w="1050"/>
+      </w:tblGrid>
+      <w:tr>
+        <w:tblPrEx>
+          <w:tblCellMar>
+            <w:top w:w="0" w:type="dxa"/>
+            <w:bottom w:w="0" w:type="dxa"/>
+          </w:tblCellMar>
+        </w:tblPrEx>
+        <w:trPr>
+          <w:tblHeader/>
+        </w:trPr>
+        <w:tc>
+          <w:tcPr>
+            <w:tcW w:w="787" w:type="dxa"/>
+            <w:shd w:val="clear" w:color="auto" w:fill="2F5496"/>
+            <w:tcMar>
+              <w:top w:w="80" w:type="dxa"/>
+              <w:left w:w="100" w:type="dxa"/>
+              <w:bottom w:w="80" w:type="dxa"/>
+              <w:right w:w="100" w:type="dxa"/>
+            </w:tcMar>
+            <w:vAlign w:val="center"/>
+          </w:tcPr>
+          <w:p>
+            <w:r>
+              <w:rPr>
+                <w:b/>
+                <w:bCs/>
+                <w:color w:val="FFFFFF"/>
+                <w:sz w:val="22"/>
+                <w:szCs w:val="22"/>
+              </w:rPr>
+              <w:t>ID</w:t>
+            </w:r>
+          </w:p>
+        </w:tc>
+        <w:tc>
+          <w:tcPr>
+            <w:tcW w:w="1924" w:type="dxa"/>
+            <w:shd w:val="clear" w:color="auto" w:fill="2F5496"/>
+            <w:tcMar>
+              <w:top w:w="80" w:type="dxa"/>
+              <w:left w:w="100" w:type="dxa"/>
+              <w:bottom w:w="80" w:type="dxa"/>
+              <w:right w:w="100" w:type="dxa"/>
+            </w:tcMar>
+            <w:vAlign w:val="center"/>
+          </w:tcPr>
+          <w:p>
+            <w:r>
+              <w:rPr>
+                <w:b/>
+                <w:bCs/>
+                <w:color w:val="FFFFFF"/>
+                <w:sz w:val="22"/>
+                <w:szCs w:val="22"/>
+              </w:rPr>
+              <w:t>As a...</w:t>
+            </w:r>
+          </w:p>
+        </w:tc>
+        <w:tc>
+          <w:tcPr>
+            <w:tcW w:w="2799" w:type="dxa"/>
+            <w:shd w:val="clear" w:color="auto" w:fill="2F5496"/>
+            <w:tcMar>
+              <w:top w:w="80" w:type="dxa"/>
+              <w:left w:w="100" w:type="dxa"/>
+              <w:bottom w:w="80" w:type="dxa"/>
+              <w:right w:w="100" w:type="dxa"/>
+            </w:tcMar>
+            <w:vAlign w:val="center"/>
+          </w:tcPr>
+          <w:p>
+            <w:r>
+              <w:rPr>
+                <w:b/>
+                <w:bCs/>
+                <w:color w:val="FFFFFF"/>
+                <w:sz w:val="22"/>
+                <w:szCs w:val="22"/>
+              </w:rPr>
+              <w:t>I want to...</w:t>
+            </w:r>
+          </w:p>
+        </w:tc>
+        <w:tc>
+          <w:tcPr>
+            <w:tcW w:w="2799" w:type="dxa"/>
+            <w:shd w:val="clear" w:color="auto" w:fill="2F5496"/>
+            <w:tcMar>
+              <w:top w:w="80" w:type="dxa"/>
+              <w:left w:w="100" w:type="dxa"/>
+              <w:bottom w:w="80" w:type="dxa"/>
+              <w:right w:w="100" w:type="dxa"/>
+            </w:tcMar>
+            <w:vAlign w:val="center"/>
+          </w:tcPr>
+          <w:p>
+            <w:r>
+              <w:rPr>
+                <w:b/>
+                <w:bCs/>
+                <w:color w:val="FFFFFF"/>
+                <w:sz w:val="22"/>
+                <w:szCs w:val="22"/>
+              </w:rPr>
+              <w:t>So that...</w:t>
+            </w:r>
+          </w:p>
+        </w:tc>
+        <w:tc>
+          <w:tcPr>
+            <w:tcW w:w="1050" w:type="dxa"/>
+            <w:shd w:val="clear" w:color="auto" w:fill="2F5496"/>
+            <w:tcMar>
+              <w:top w:w="80" w:type="dxa"/>
+              <w:left w:w="100" w:type="dxa"/>
+              <w:bottom w:w="80" w:type="dxa"/>
+              <w:right w:w="100" w:type="dxa"/>
+            </w:tcMar>
+            <w:vAlign w:val="center"/>
+          </w:tcPr>
+          <w:p>
+            <w:r>
+              <w:rPr>
+                <w:b/>
+                <w:bCs/>
+                <w:color w:val="FFFFFF"/>
+                <w:sz w:val="22"/>
+                <w:szCs w:val="22"/>
+              </w:rPr>
+              <w:t>Priority</w:t>
+            </w:r>
+          </w:p>
+        </w:tc>
+      </w:tr>
+      <w:tr>
+        <w:tblPrEx>
+          <w:tblCellMar>
+            <w:top w:w="0" w:type="dxa"/>
+            <w:bottom w:w="0" w:type="dxa"/>
+          </w:tblCellMar>
+        </w:tblPrEx>
+        <w:tc>
+          <w:tcPr>
+            <w:tcW w:w="787" w:type="dxa"/>
+            <w:tcMar>
+              <w:top w:w="80" w:type="dxa"/>
+              <w:left w:w="100" w:type="dxa"/>
+              <w:bottom w:w="80" w:type="dxa"/>
+              <w:right w:w="100" w:type="dxa"/>
+            </w:tcMar>
+            <w:vAlign w:val="center"/>
+          </w:tcPr>
+          <w:p>
+            <w:r>
+              <w:rPr>
+                <w:sz w:val="22"/>
+                <w:szCs w:val="22"/>
+              </w:rPr>
+              <w:t>US-01</w:t>
+            </w:r>
+          </w:p>
+        </w:tc>
+        <w:tc>
+          <w:tcPr>
+            <w:tcW w:w="1924" w:type="dxa"/>
+            <w:tcMar>
+              <w:top w:w="80" w:type="dxa"/>
+              <w:left w:w="100" w:type="dxa"/>
+              <w:bottom w:w="80" w:type="dxa"/>
+              <w:right w:w="100" w:type="dxa"/>
+            </w:tcMar>
+            <w:vAlign w:val="center"/>
+          </w:tcPr>
+          <w:p>
+            <w:r>
+              <w:rPr>
+                <w:sz w:val="22"/>
+                <w:szCs w:val="22"/>
+              </w:rPr>
+              <w:t>New student</w:t>
+            </w:r>
+          </w:p>
+        </w:tc>
+        <w:tc>
+          <w:tcPr>
+            <w:tcW w:w="2799" w:type="dxa"/>
+            <w:tcMar>
+              <w:top w:w="80" w:type="dxa"/>
+              <w:left w:w="100" w:type="dxa"/>
+              <w:bottom w:w="80" w:type="dxa"/>
+              <w:right w:w="100" w:type="dxa"/>
+            </w:tcMar>
+            <w:vAlign w:val="center"/>
+          </w:tcPr>
+          <w:p>
+            <w:r>
+              <w:rPr>
+                <w:sz w:val="22"/>
+                <w:szCs w:val="22"/>
+              </w:rPr>
+              <w:t>register using my university email</w:t>
+            </w:r>
+          </w:p>
+        </w:tc>
+        <w:tc>
+          <w:tcPr>
+            <w:tcW w:w="2799" w:type="dxa"/>
+            <w:tcMar>
+              <w:top w:w="80" w:type="dxa"/>
+              <w:left w:w="100" w:type="dxa"/>
+              <w:bottom w:w="80" w:type="dxa"/>
+              <w:right w:w="100" w:type="dxa"/>
+            </w:tcMar>
+            <w:vAlign w:val="center"/>
+          </w:tcPr>
+          <w:p>
+            <w:r>
+              <w:rPr>
+                <w:sz w:val="22"/>
+                <w:szCs w:val="22"/>
+              </w:rPr>
+              <w:t>I can access a platform restricted to verified students</w:t>
+            </w:r>
+          </w:p>
+        </w:tc>
+        <w:tc>
+          <w:tcPr>
+            <w:tcW w:w="1050" w:type="dxa"/>
+            <w:tcMar>
+              <w:top w:w="80" w:type="dxa"/>
+              <w:left w:w="100" w:type="dxa"/>
+              <w:bottom w:w="80" w:type="dxa"/>
+              <w:right w:w="100" w:type="dxa"/>
+            </w:tcMar>
+            <w:vAlign w:val="center"/>
+          </w:tcPr>
+          <w:p>
+            <w:r>
+              <w:rPr>
+                <w:sz w:val="22"/>
+                <w:szCs w:val="22"/>
+              </w:rPr>
+              <w:t>High</w:t>
+            </w:r>
+          </w:p>
+        </w:tc>
+      </w:tr>
+      <w:tr>
+        <w:tblPrEx>
+          <w:tblCellMar>
+            <w:top w:w="0" w:type="dxa"/>
+            <w:bottom w:w="0" w:type="dxa"/>
+          </w:tblCellMar>
+        </w:tblPrEx>
+        <w:tc>
+          <w:tcPr>
+            <w:tcW w:w="787" w:type="dxa"/>
+            <w:tcMar>
+              <w:top w:w="80" w:type="dxa"/>
+              <w:left w:w="100" w:type="dxa"/>
+              <w:bottom w:w="80" w:type="dxa"/>
+              <w:right w:w="100" w:type="dxa"/>
+            </w:tcMar>
+            <w:vAlign w:val="center"/>
+          </w:tcPr>
+          <w:p>
+            <w:r>
+              <w:rPr>
+                <w:sz w:val="22"/>
+                <w:szCs w:val="22"/>
+              </w:rPr>
+              <w:t>US-02</w:t>
+            </w:r>
+          </w:p>
+        </w:tc>
+        <w:tc>
+          <w:tcPr>
+            <w:tcW w:w="1924" w:type="dxa"/>
+            <w:tcMar>
+              <w:top w:w="80" w:type="dxa"/>
+              <w:left w:w="100" w:type="dxa"/>
+              <w:bottom w:w="80" w:type="dxa"/>
+              <w:right w:w="100" w:type="dxa"/>
+            </w:tcMar>
+            <w:vAlign w:val="center"/>
+          </w:tcPr>
+          <w:p>
+            <w:r>
+              <w:rPr>
+                <w:sz w:val="22"/>
+                <w:szCs w:val="22"/>
+              </w:rPr>
+              <w:t>Registered student</w:t>
+            </w:r>
+          </w:p>
+        </w:tc>
+        <w:tc>
+          <w:tcPr>
+            <w:tcW w:w="2799" w:type="dxa"/>
+            <w:tcMar>
+              <w:top w:w="80" w:type="dxa"/>
+              <w:left w:w="100" w:type="dxa"/>
+              <w:bottom w:w="80" w:type="dxa"/>
+              <w:right w:w="100" w:type="dxa"/>
+            </w:tcMar>
+            <w:vAlign w:val="center"/>
+          </w:tcPr>
+          <w:p>
+            <w:r>
+              <w:rPr>
+                <w:sz w:val="22"/>
+                <w:szCs w:val="22"/>
+              </w:rPr>
+              <w:t>log in and out securely</w:t>
+            </w:r>
+          </w:p>
+        </w:tc>
+        <w:tc>
+          <w:tcPr>
+            <w:tcW w:w="2799" w:type="dxa"/>
+            <w:tcMar>
+              <w:top w:w="80" w:type="dxa"/>
+              <w:left w:w="100" w:type="dxa"/>
+              <w:bottom w:w="80" w:type="dxa"/>
+              <w:right w:w="100" w:type="dxa"/>
+            </w:tcMar>
+            <w:vAlign w:val="center"/>
+          </w:tcPr>
+          <w:p>
+            <w:r>
+              <w:rPr>
+                <w:sz w:val="22"/>
+                <w:szCs w:val="22"/>
+              </w:rPr>
+              <w:t>my account and messages remain private</w:t>
+            </w:r>
+          </w:p>
+        </w:tc>
+        <w:tc>
+          <w:tcPr>
+            <w:tcW w:w="1050" w:type="dxa"/>
+            <w:tcMar>
+              <w:top w:w="80" w:type="dxa"/>
+              <w:left w:w="100" w:type="dxa"/>
+              <w:bottom w:w="80" w:type="dxa"/>
+              <w:right w:w="100" w:type="dxa"/>
+            </w:tcMar>
+            <w:vAlign w:val="center"/>
+          </w:tcPr>
+          <w:p>
+            <w:r>
+              <w:rPr>
+                <w:sz w:val="22"/>
+                <w:szCs w:val="22"/>
+              </w:rPr>
+              <w:t>High</w:t>
+            </w:r>
+          </w:p>
+        </w:tc>
+      </w:tr>
+      <w:tr>
+        <w:tblPrEx>
+          <w:tblCellMar>
+            <w:top w:w="0" w:type="dxa"/>
+            <w:bottom w:w="0" w:type="dxa"/>
+          </w:tblCellMar>
+        </w:tblPrEx>
+        <w:tc>
+          <w:tcPr>
+            <w:tcW w:w="787" w:type="dxa"/>
+            <w:tcMar>
+              <w:top w:w="80" w:type="dxa"/>
+              <w:left w:w="100" w:type="dxa"/>
+              <w:bottom w:w="80" w:type="dxa"/>
+              <w:right w:w="100" w:type="dxa"/>
+            </w:tcMar>
+            <w:vAlign w:val="center"/>
+          </w:tcPr>
+          <w:p>
+            <w:r>
+              <w:rPr>
+                <w:sz w:val="22"/>
+                <w:szCs w:val="22"/>
+              </w:rPr>
+              <w:t>US-03</w:t>
+            </w:r>
+          </w:p>
+        </w:tc>
+        <w:tc>
+          <w:tcPr>
+            <w:tcW w:w="1924" w:type="dxa"/>
+            <w:tcMar>
+              <w:top w:w="80" w:type="dxa"/>
+              <w:left w:w="100" w:type="dxa"/>
+              <w:bottom w:w="80" w:type="dxa"/>
+              <w:right w:w="100" w:type="dxa"/>
+            </w:tcMar>
+            <w:vAlign w:val="center"/>
+          </w:tcPr>
+          <w:p>
+            <w:r>
+              <w:rPr>
+                <w:sz w:val="22"/>
+                <w:szCs w:val="22"/>
+              </w:rPr>
+              <w:t>Seller</w:t>
+            </w:r>
+          </w:p>
+        </w:tc>
+        <w:tc>
+          <w:tcPr>
+            <w:tcW w:w="2799" w:type="dxa"/>
+            <w:tcMar>
+              <w:top w:w="80" w:type="dxa"/>
+              <w:left w:w="100" w:type="dxa"/>
+              <w:bottom w:w="80" w:type="dxa"/>
+              <w:right w:w="100" w:type="dxa"/>
+            </w:tcMar>
+            <w:vAlign w:val="center"/>
+          </w:tcPr>
+          <w:p>
+            <w:r>
+              <w:rPr>
+                <w:sz w:val="22"/>
+                <w:szCs w:val="22"/>
+              </w:rPr>
+              <w:t>create a listing with photos and a description</w:t>
+            </w:r>
+          </w:p>
+        </w:tc>
+        <w:tc>
+          <w:tcPr>
+            <w:tcW w:w="2799" w:type="dxa"/>
+            <w:tcMar>
+              <w:top w:w="80" w:type="dxa"/>
+              <w:left w:w="100" w:type="dxa"/>
+              <w:bottom w:w="80" w:type="dxa"/>
+              <w:right w:w="100" w:type="dxa"/>
+            </w:tcMar>
+            <w:vAlign w:val="center"/>
+          </w:tcPr>
+          <w:p>
+            <w:r>
+              <w:rPr>
+                <w:sz w:val="22"/>
+                <w:szCs w:val="22"/>
+              </w:rPr>
+              <w:t>buyers can see what I am selling</w:t>
+            </w:r>
+          </w:p>
+        </w:tc>
+        <w:tc>
+          <w:tcPr>
+            <w:tcW w:w="1050" w:type="dxa"/>
+            <w:tcMar>
+              <w:top w:w="80" w:type="dxa"/>
+              <w:left w:w="100" w:type="dxa"/>
+              <w:bottom w:w="80" w:type="dxa"/>
+              <w:right w:w="100" w:type="dxa"/>
+            </w:tcMar>
+            <w:vAlign w:val="center"/>
+          </w:tcPr>
+          <w:p>
+            <w:r>
+              <w:rPr>
+                <w:sz w:val="22"/>
+                <w:szCs w:val="22"/>
+              </w:rPr>
+              <w:t>High</w:t>
+            </w:r>
+          </w:p>
+        </w:tc>
+      </w:tr>
+      <w:tr>
+        <w:tblPrEx>
+          <w:tblCellMar>
+            <w:top w:w="0" w:type="dxa"/>
+            <w:bottom w:w="0" w:type="dxa"/>
+          </w:tblCellMar>
+        </w:tblPrEx>
+        <w:tc>
+          <w:tcPr>
+            <w:tcW w:w="787" w:type="dxa"/>
+            <w:tcMar>
+              <w:top w:w="80" w:type="dxa"/>
+              <w:left w:w="100" w:type="dxa"/>
+              <w:bottom w:w="80" w:type="dxa"/>
+              <w:right w:w="100" w:type="dxa"/>
+            </w:tcMar>
+            <w:vAlign w:val="center"/>
+          </w:tcPr>
+          <w:p>
+            <w:r>
+              <w:rPr>
+                <w:sz w:val="22"/>
+                <w:szCs w:val="22"/>
+              </w:rPr>
+              <w:t>US-04</w:t>
+            </w:r>
+          </w:p>
+        </w:tc>
+        <w:tc>
+          <w:tcPr>
+            <w:tcW w:w="1924" w:type="dxa"/>
+            <w:tcMar>
+              <w:top w:w="80" w:type="dxa"/>
+              <w:left w:w="100" w:type="dxa"/>
+              <w:bottom w:w="80" w:type="dxa"/>
+              <w:right w:w="100" w:type="dxa"/>
+            </w:tcMar>
+            <w:vAlign w:val="center"/>
+          </w:tcPr>
+          <w:p>
+            <w:r>
+              <w:rPr>
+                <w:sz w:val="22"/>
+                <w:szCs w:val="22"/>
+              </w:rPr>
+              <w:t>Seller</w:t>
+            </w:r>
+          </w:p>
+        </w:tc>
+        <w:tc>
+          <w:tcPr>
+            <w:tcW w:w="2799" w:type="dxa"/>
+            <w:tcMar>
+              <w:top w:w="80" w:type="dxa"/>
+              <w:left w:w="100" w:type="dxa"/>
+              <w:bottom w:w="80" w:type="dxa"/>
+              <w:right w:w="100" w:type="dxa"/>
+            </w:tcMar>
+            <w:vAlign w:val="center"/>
+          </w:tcPr>
+          <w:p>
+            <w:r>
+              <w:rPr>
+                <w:sz w:val="22"/>
+                <w:szCs w:val="22"/>
+              </w:rPr>
+              <w:t>edit or delete my own listing</w:t>
+            </w:r>
+          </w:p>
+        </w:tc>
+        <w:tc>
+          <w:tcPr>
+            <w:tcW w:w="2799" w:type="dxa"/>
+            <w:tcMar>
+              <w:top w:w="80" w:type="dxa"/>
+              <w:left w:w="100" w:type="dxa"/>
+              <w:bottom w:w="80" w:type="dxa"/>
+              <w:right w:w="100" w:type="dxa"/>
+            </w:tcMar>
+            <w:vAlign w:val="center"/>
+          </w:tcPr>
+          <w:p>
+            <w:r>
+              <w:rPr>
+                <w:sz w:val="22"/>
+                <w:szCs w:val="22"/>
+              </w:rPr>
+              <w:t>I can correct mistakes or remove sold/unwanted items</w:t>
+            </w:r>
+          </w:p>
+        </w:tc>
+        <w:tc>
+          <w:tcPr>
+            <w:tcW w:w="1050" w:type="dxa"/>
+            <w:tcMar>
+              <w:top w:w="80" w:type="dxa"/>
+              <w:left w:w="100" w:type="dxa"/>
+              <w:bottom w:w="80" w:type="dxa"/>
+              <w:right w:w="100" w:type="dxa"/>
+            </w:tcMar>
+            <w:vAlign w:val="center"/>
+          </w:tcPr>
+          <w:p>
+            <w:r>
+              <w:rPr>
+                <w:sz w:val="22"/>
+                <w:szCs w:val="22"/>
+              </w:rPr>
+              <w:t>Medium</w:t>
+            </w:r>
+          </w:p>
+        </w:tc>
+      </w:tr>
+      <w:tr>
+        <w:tblPrEx>
+          <w:tblCellMar>
+            <w:top w:w="0" w:type="dxa"/>
+            <w:bottom w:w="0" w:type="dxa"/>
+          </w:tblCellMar>
+        </w:tblPrEx>
+        <w:tc>
+          <w:tcPr>
+            <w:tcW w:w="787" w:type="dxa"/>
+            <w:tcMar>
+              <w:top w:w="80" w:type="dxa"/>
+              <w:left w:w="100" w:type="dxa"/>
+              <w:bottom w:w="80" w:type="dxa"/>
+              <w:right w:w="100" w:type="dxa"/>
+            </w:tcMar>
+            <w:vAlign w:val="center"/>
+          </w:tcPr>
+          <w:p>
+            <w:r>
+              <w:rPr>
+                <w:sz w:val="22"/>
+                <w:szCs w:val="22"/>
+              </w:rPr>
+              <w:t>US-05</w:t>
+            </w:r>
+          </w:p>
+        </w:tc>
+        <w:tc>
+          <w:tcPr>
+            <w:tcW w:w="1924" w:type="dxa"/>
+            <w:tcMar>
+              <w:top w:w="80" w:type="dxa"/>
+              <w:left w:w="100" w:type="dxa"/>
+              <w:bottom w:w="80" w:type="dxa"/>
+              <w:right w:w="100" w:type="dxa"/>
+            </w:tcMar>
+            <w:vAlign w:val="center"/>
+          </w:tcPr>
+          <w:p>
+            <w:r>
+              <w:rPr>
+                <w:sz w:val="22"/>
+                <w:szCs w:val="22"/>
+              </w:rPr>
+              <w:t>Buyer</w:t>
+            </w:r>
+          </w:p>
+        </w:tc>
+        <w:tc>
+          <w:tcPr>
+            <w:tcW w:w="2799" w:type="dxa"/>
+            <w:tcMar>
+              <w:top w:w="80" w:type="dxa"/>
+              <w:left w:w="100" w:type="dxa"/>
+              <w:bottom w:w="80" w:type="dxa"/>
+              <w:right w:w="100" w:type="dxa"/>
+            </w:tcMar>
+            <w:vAlign w:val="center"/>
+          </w:tcPr>
+          <w:p>
+            <w:r>
+              <w:rPr>
+                <w:sz w:val="22"/>
+                <w:szCs w:val="22"/>
+              </w:rPr>
+              <w:t>search and filter listings by category, price, and condition</w:t>
+            </w:r>
+          </w:p>
+        </w:tc>
+        <w:tc>
+          <w:tcPr>
+            <w:tcW w:w="2799" w:type="dxa"/>
+            <w:tcMar>
+              <w:top w:w="80" w:type="dxa"/>
+              <w:left w:w="100" w:type="dxa"/>
+              <w:bottom w:w="80" w:type="dxa"/>
+              <w:right w:w="100" w:type="dxa"/>
+            </w:tcMar>
+            <w:vAlign w:val="center"/>
+          </w:tcPr>
+          <w:p>
+            <w:r>
+              <w:rPr>
+                <w:sz w:val="22"/>
+                <w:szCs w:val="22"/>
+              </w:rPr>
+              <w:t>I can quickly find items I am interested in</w:t>
+            </w:r>
+          </w:p>
+        </w:tc>
+        <w:tc>
+          <w:tcPr>
+            <w:tcW w:w="1050" w:type="dxa"/>
+            <w:tcMar>
+              <w:top w:w="80" w:type="dxa"/>
+              <w:left w:w="100" w:type="dxa"/>
+              <w:bottom w:w="80" w:type="dxa"/>
+              <w:right w:w="100" w:type="dxa"/>
+            </w:tcMar>
+            <w:vAlign w:val="center"/>
+          </w:tcPr>
+          <w:p>
+            <w:r>
+              <w:rPr>
+                <w:sz w:val="22"/>
+                <w:szCs w:val="22"/>
+              </w:rPr>
+              <w:t>High</w:t>
+            </w:r>
+          </w:p>
+        </w:tc>
+      </w:tr>
+      <w:tr>
+        <w:tblPrEx>
+          <w:tblCellMar>
+            <w:top w:w="0" w:type="dxa"/>
+            <w:bottom w:w="0" w:type="dxa"/>
+          </w:tblCellMar>
+        </w:tblPrEx>
+        <w:tc>
+          <w:tcPr>
+            <w:tcW w:w="787" w:type="dxa"/>
+            <w:tcMar>
+              <w:top w:w="80" w:type="dxa"/>
+              <w:left w:w="100" w:type="dxa"/>
+              <w:bottom w:w="80" w:type="dxa"/>
+              <w:right w:w="100" w:type="dxa"/>
+            </w:tcMar>
+            <w:vAlign w:val="center"/>
+          </w:tcPr>
+          <w:p>
+            <w:r>
+              <w:rPr>
+                <w:sz w:val="22"/>
+                <w:szCs w:val="22"/>
+              </w:rPr>
+              <w:t>US-06</w:t>
+            </w:r>
+          </w:p>
+        </w:tc>
+        <w:tc>
+          <w:tcPr>
+            <w:tcW w:w="1924" w:type="dxa"/>
+            <w:tcMar>
+              <w:top w:w="80" w:type="dxa"/>
+              <w:left w:w="100" w:type="dxa"/>
+              <w:bottom w:w="80" w:type="dxa"/>
+              <w:right w:w="100" w:type="dxa"/>
+            </w:tcMar>
+            <w:vAlign w:val="center"/>
+          </w:tcPr>
+          <w:p>
+            <w:r>
+              <w:rPr>
+                <w:sz w:val="22"/>
+                <w:szCs w:val="22"/>
+              </w:rPr>
+              <w:t>Buyer</w:t>
+            </w:r>
+          </w:p>
+        </w:tc>
+        <w:tc>
+          <w:tcPr>
+            <w:tcW w:w="2799" w:type="dxa"/>
+            <w:tcMar>
+              <w:top w:w="80" w:type="dxa"/>
+              <w:left w:w="100" w:type="dxa"/>
+              <w:bottom w:w="80" w:type="dxa"/>
+              <w:right w:w="100" w:type="dxa"/>
+            </w:tcMar>
+            <w:vAlign w:val="center"/>
+          </w:tcPr>
+          <w:p>
+            <w:r>
+              <w:rPr>
+                <w:sz w:val="22"/>
+                <w:szCs w:val="22"/>
+              </w:rPr>
+              <w:t>message a seller about a listing</w:t>
+            </w:r>
+          </w:p>
+        </w:tc>
+        <w:tc>
+          <w:tcPr>
+            <w:tcW w:w="2799" w:type="dxa"/>
+            <w:tcMar>
+              <w:top w:w="80" w:type="dxa"/>
+              <w:left w:w="100" w:type="dxa"/>
+              <w:bottom w:w="80" w:type="dxa"/>
+              <w:right w:w="100" w:type="dxa"/>
+            </w:tcMar>
+            <w:vAlign w:val="center"/>
+          </w:tcPr>
+          <w:p>
+            <w:r>
+              <w:rPr>
+                <w:sz w:val="22"/>
+                <w:szCs w:val="22"/>
+              </w:rPr>
+              <w:t>I can ask questions or negotiate without sharing my phone number</w:t>
+            </w:r>
+          </w:p>
+        </w:tc>
+        <w:tc>
+          <w:tcPr>
+            <w:tcW w:w="1050" w:type="dxa"/>
+            <w:tcMar>
+              <w:top w:w="80" w:type="dxa"/>
+              <w:left w:w="100" w:type="dxa"/>
+              <w:bottom w:w="80" w:type="dxa"/>
+              <w:right w:w="100" w:type="dxa"/>
+            </w:tcMar>
+            <w:vAlign w:val="center"/>
+          </w:tcPr>
+          <w:p>
+            <w:r>
+              <w:rPr>
+                <w:sz w:val="22"/>
+                <w:szCs w:val="22"/>
+              </w:rPr>
+              <w:t>High</w:t>
+            </w:r>
+          </w:p>
+        </w:tc>
+      </w:tr>
+      <w:tr>
+        <w:tblPrEx>
+          <w:tblCellMar>
+            <w:top w:w="0" w:type="dxa"/>
+            <w:bottom w:w="0" w:type="dxa"/>
+          </w:tblCellMar>
+        </w:tblPrEx>
+        <w:tc>
+          <w:tcPr>
+            <w:tcW w:w="787" w:type="dxa"/>
+            <w:tcMar>
+              <w:top w:w="80" w:type="dxa"/>
+              <w:left w:w="100" w:type="dxa"/>
+              <w:bottom w:w="80" w:type="dxa"/>
+              <w:right w:w="100" w:type="dxa"/>
+            </w:tcMar>
+            <w:vAlign w:val="center"/>
+          </w:tcPr>
+          <w:p>
+            <w:r>
+              <w:rPr>
+                <w:sz w:val="22"/>
+                <w:szCs w:val="22"/>
+              </w:rPr>
+              <w:t>US-07</w:t>
+            </w:r>
+          </w:p>
+        </w:tc>
+        <w:tc>
+          <w:tcPr>
+            <w:tcW w:w="1924" w:type="dxa"/>
+            <w:tcMar>
+              <w:top w:w="80" w:type="dxa"/>
+              <w:left w:w="100" w:type="dxa"/>
+              <w:bottom w:w="80" w:type="dxa"/>
+              <w:right w:w="100" w:type="dxa"/>
+            </w:tcMar>
+            <w:vAlign w:val="center"/>
+          </w:tcPr>
+          <w:p>
+            <w:r>
+              <w:rPr>
+                <w:sz w:val="22"/>
+                <w:szCs w:val="22"/>
+              </w:rPr>
+              <w:t>Seller</w:t>
+            </w:r>
+          </w:p>
+        </w:tc>
+        <w:tc>
+          <w:tcPr>
+            <w:tcW w:w="2799" w:type="dxa"/>
+            <w:tcMar>
+              <w:top w:w="80" w:type="dxa"/>
+              <w:left w:w="100" w:type="dxa"/>
+              <w:bottom w:w="80" w:type="dxa"/>
+              <w:right w:w="100" w:type="dxa"/>
+            </w:tcMar>
+            <w:vAlign w:val="center"/>
+          </w:tcPr>
+          <w:p>
+            <w:r>
+              <w:rPr>
+                <w:sz w:val="22"/>
+                <w:szCs w:val="22"/>
+              </w:rPr>
+              <w:t>mark a listing as sold</w:t>
+            </w:r>
+          </w:p>
+        </w:tc>
+        <w:tc>
+          <w:tcPr>
+            <w:tcW w:w="2799" w:type="dxa"/>
+            <w:tcMar>
+              <w:top w:w="80" w:type="dxa"/>
+              <w:left w:w="100" w:type="dxa"/>
+              <w:bottom w:w="80" w:type="dxa"/>
+              <w:right w:w="100" w:type="dxa"/>
+            </w:tcMar>
+            <w:vAlign w:val="center"/>
+          </w:tcPr>
+          <w:p>
+            <w:r>
+              <w:rPr>
+                <w:sz w:val="22"/>
+                <w:szCs w:val="22"/>
+              </w:rPr>
+              <w:t>it no longer appears in active search results</w:t>
+            </w:r>
+          </w:p>
+        </w:tc>
+        <w:tc>
+          <w:tcPr>
+            <w:tcW w:w="1050" w:type="dxa"/>
+            <w:tcMar>
+              <w:top w:w="80" w:type="dxa"/>
+              <w:left w:w="100" w:type="dxa"/>
+              <w:bottom w:w="80" w:type="dxa"/>
+              <w:right w:w="100" w:type="dxa"/>
+            </w:tcMar>
+            <w:vAlign w:val="center"/>
+          </w:tcPr>
+          <w:p>
+            <w:r>
+              <w:rPr>
+                <w:sz w:val="22"/>
+                <w:szCs w:val="22"/>
+              </w:rPr>
+              <w:t>Medium</w:t>
+            </w:r>
+          </w:p>
+        </w:tc>
+      </w:tr>
+      <w:tr>
+        <w:tblPrEx>
+          <w:tblCellMar>
+            <w:top w:w="0" w:type="dxa"/>
+            <w:bottom w:w="0" w:type="dxa"/>
+          </w:tblCellMar>
+        </w:tblPrEx>
+        <w:tc>
+          <w:tcPr>
+            <w:tcW w:w="787" w:type="dxa"/>
+            <w:tcMar>
+              <w:top w:w="80" w:type="dxa"/>
+              <w:left w:w="100" w:type="dxa"/>
+              <w:bottom w:w="80" w:type="dxa"/>
+              <w:right w:w="100" w:type="dxa"/>
+            </w:tcMar>
+            <w:vAlign w:val="center"/>
+          </w:tcPr>
+          <w:p>
+            <w:r>
+              <w:rPr>
+                <w:sz w:val="22"/>
+                <w:szCs w:val="22"/>
+              </w:rPr>
+              <w:t>US-08</w:t>
+            </w:r>
+          </w:p>
+        </w:tc>
+        <w:tc>
+          <w:tcPr>
+            <w:tcW w:w="1924" w:type="dxa"/>
+            <w:tcMar>
+              <w:top w:w="80" w:type="dxa"/>
+              <w:left w:w="100" w:type="dxa"/>
+              <w:bottom w:w="80" w:type="dxa"/>
+              <w:right w:w="100" w:type="dxa"/>
+            </w:tcMar>
+            <w:vAlign w:val="center"/>
+          </w:tcPr>
+          <w:p>
+            <w:r>
+              <w:rPr>
+                <w:sz w:val="22"/>
+                <w:szCs w:val="22"/>
+              </w:rPr>
+              <w:t>Buyer or Seller</w:t>
+            </w:r>
+          </w:p>
+        </w:tc>
+        <w:tc>
+          <w:tcPr>
+            <w:tcW w:w="2799" w:type="dxa"/>
+            <w:tcMar>
+              <w:top w:w="80" w:type="dxa"/>
+              <w:left w:w="100" w:type="dxa"/>
+              <w:bottom w:w="80" w:type="dxa"/>
+              <w:right w:w="100" w:type="dxa"/>
+            </w:tcMar>
+            <w:vAlign w:val="center"/>
+          </w:tcPr>
+          <w:p>
+            <w:r>
+              <w:rPr>
+                <w:sz w:val="22"/>
+                <w:szCs w:val="22"/>
+              </w:rPr>
+              <w:t>rate the other party after a completed transaction</w:t>
+            </w:r>
+          </w:p>
+        </w:tc>
+        <w:tc>
+          <w:tcPr>
+            <w:tcW w:w="2799" w:type="dxa"/>
+            <w:tcMar>
+              <w:top w:w="80" w:type="dxa"/>
+              <w:left w:w="100" w:type="dxa"/>
+              <w:bottom w:w="80" w:type="dxa"/>
+              <w:right w:w="100" w:type="dxa"/>
+            </w:tcMar>
+            <w:vAlign w:val="center"/>
+          </w:tcPr>
+          <w:p>
+            <w:r>
+              <w:rPr>
+                <w:sz w:val="22"/>
+                <w:szCs w:val="22"/>
+              </w:rPr>
+              <w:t>future users can judge reliability before dealing with them</w:t>
+            </w:r>
+          </w:p>
+        </w:tc>
+        <w:tc>
+          <w:tcPr>
+            <w:tcW w:w="1050" w:type="dxa"/>
+            <w:tcMar>
+              <w:top w:w="80" w:type="dxa"/>
+              <w:left w:w="100" w:type="dxa"/>
+              <w:bottom w:w="80" w:type="dxa"/>
+              <w:right w:w="100" w:type="dxa"/>
+            </w:tcMar>
+            <w:vAlign w:val="center"/>
+          </w:tcPr>
+          <w:p>
+            <w:r>
+              <w:rPr>
+                <w:sz w:val="22"/>
+                <w:szCs w:val="22"/>
+              </w:rPr>
+              <w:t>Medium</w:t>
+            </w:r>
+          </w:p>
+        </w:tc>
+      </w:tr>
+      <w:tr>
+        <w:tblPrEx>
+          <w:tblCellMar>
+            <w:top w:w="0" w:type="dxa"/>
+            <w:bottom w:w="0" w:type="dxa"/>
+          </w:tblCellMar>
+        </w:tblPrEx>
+        <w:tc>
+          <w:tcPr>
+            <w:tcW w:w="787" w:type="dxa"/>
+            <w:tcMar>
+              <w:top w:w="80" w:type="dxa"/>
+              <w:left w:w="100" w:type="dxa"/>
+              <w:bottom w:w="80" w:type="dxa"/>
+              <w:right w:w="100" w:type="dxa"/>
+            </w:tcMar>
+            <w:vAlign w:val="center"/>
+          </w:tcPr>
+          <w:p>
+            <w:r>
+              <w:rPr>
+                <w:sz w:val="22"/>
+                <w:szCs w:val="22"/>
+              </w:rPr>
+              <w:t>US-09</w:t>
+            </w:r>
+          </w:p>
+        </w:tc>
+        <w:tc>
+          <w:tcPr>
+            <w:tcW w:w="1924" w:type="dxa"/>
+            <w:tcMar>
+              <w:top w:w="80" w:type="dxa"/>
+              <w:left w:w="100" w:type="dxa"/>
+              <w:bottom w:w="80" w:type="dxa"/>
+              <w:right w:w="100" w:type="dxa"/>
+            </w:tcMar>
+            <w:vAlign w:val="center"/>
+          </w:tcPr>
+          <w:p>
+            <w:r>
+              <w:rPr>
+                <w:sz w:val="22"/>
+                <w:szCs w:val="22"/>
+              </w:rPr>
+              <w:t>Student</w:t>
+            </w:r>
+          </w:p>
+        </w:tc>
+        <w:tc>
+          <w:tcPr>
+            <w:tcW w:w="2799" w:type="dxa"/>
+            <w:tcMar>
+              <w:top w:w="80" w:type="dxa"/>
+              <w:left w:w="100" w:type="dxa"/>
+              <w:bottom w:w="80" w:type="dxa"/>
+              <w:right w:w="100" w:type="dxa"/>
+            </w:tcMar>
+            <w:vAlign w:val="center"/>
+          </w:tcPr>
+          <w:p>
+            <w:r>
+              <w:rPr>
+                <w:sz w:val="22"/>
+                <w:szCs w:val="22"/>
+              </w:rPr>
+              <w:t>receive a notification when I get a new message</w:t>
+            </w:r>
+          </w:p>
+        </w:tc>
+        <w:tc>
+          <w:tcPr>
+            <w:tcW w:w="2799" w:type="dxa"/>
+            <w:tcMar>
+              <w:top w:w="80" w:type="dxa"/>
+              <w:left w:w="100" w:type="dxa"/>
+              <w:bottom w:w="80" w:type="dxa"/>
+              <w:right w:w="100" w:type="dxa"/>
+            </w:tcMar>
+            <w:vAlign w:val="center"/>
+          </w:tcPr>
+          <w:p>
+            <w:r>
+              <w:rPr>
+                <w:sz w:val="22"/>
+                <w:szCs w:val="22"/>
+              </w:rPr>
+              <w:t>I can respond promptly</w:t>
+            </w:r>
+          </w:p>
+        </w:tc>
+        <w:tc>
+          <w:tcPr>
+            <w:tcW w:w="1050" w:type="dxa"/>
+            <w:tcMar>
+              <w:top w:w="80" w:type="dxa"/>
+              <w:left w:w="100" w:type="dxa"/>
+              <w:bottom w:w="80" w:type="dxa"/>
+              <w:right w:w="100" w:type="dxa"/>
+            </w:tcMar>
+            <w:vAlign w:val="center"/>
+          </w:tcPr>
+          <w:p>
+            <w:r>
+              <w:rPr>
+                <w:sz w:val="22"/>
+                <w:szCs w:val="22"/>
+              </w:rPr>
+              <w:t>Low</w:t>
+            </w:r>
+          </w:p>
+        </w:tc>
+      </w:tr>
+      <w:tr>
+        <w:tblPrEx>
+          <w:tblCellMar>
+            <w:top w:w="0" w:type="dxa"/>
+            <w:bottom w:w="0" w:type="dxa"/>
+          </w:tblCellMar>
+        </w:tblPrEx>
+        <w:tc>
+          <w:tcPr>
+            <w:tcW w:w="787" w:type="dxa"/>
+            <w:tcMar>
+              <w:top w:w="80" w:type="dxa"/>
+              <w:left w:w="100" w:type="dxa"/>
+              <w:bottom w:w="80" w:type="dxa"/>
+              <w:right w:w="100" w:type="dxa"/>
+            </w:tcMar>
+            <w:vAlign w:val="center"/>
+          </w:tcPr>
+          <w:p>
+            <w:r>
+              <w:rPr>
+                <w:sz w:val="22"/>
+                <w:szCs w:val="22"/>
+              </w:rPr>
+              <w:t>US-10</w:t>
+            </w:r>
+          </w:p>
+        </w:tc>
+        <w:tc>
+          <w:tcPr>
+            <w:tcW w:w="1924" w:type="dxa"/>
+            <w:tcMar>
+              <w:top w:w="80" w:type="dxa"/>
+              <w:left w:w="100" w:type="dxa"/>
+              <w:bottom w:w="80" w:type="dxa"/>
+              <w:right w:w="100" w:type="dxa"/>
+            </w:tcMar>
+            <w:vAlign w:val="center"/>
+          </w:tcPr>
+          <w:p>
+            <w:r>
+              <w:rPr>
+                <w:sz w:val="22"/>
+                <w:szCs w:val="22"/>
+              </w:rPr>
+              <w:t>Administrator</w:t>
+            </w:r>
+          </w:p>
+        </w:tc>
+        <w:tc>
+          <w:tcPr>
+            <w:tcW w:w="2799" w:type="dxa"/>
+            <w:tcMar>
+              <w:top w:w="80" w:type="dxa"/>
+              <w:left w:w="100" w:type="dxa"/>
+              <w:bottom w:w="80" w:type="dxa"/>
+              <w:right w:w="100" w:type="dxa"/>
+            </w:tcMar>
+            <w:vAlign w:val="center"/>
+          </w:tcPr>
+          <w:p>
+            <w:r>
+              <w:rPr>
+                <w:sz w:val="22"/>
+                <w:szCs w:val="22"/>
+              </w:rPr>
+              <w:t>remove a listing that violates platform rules</w:t>
+            </w:r>
+          </w:p>
+        </w:tc>
+        <w:tc>
+          <w:tcPr>
+            <w:tcW w:w="2799" w:type="dxa"/>
+            <w:tcMar>
+              <w:top w:w="80" w:type="dxa"/>
+              <w:left w:w="100" w:type="dxa"/>
+              <w:bottom w:w="80" w:type="dxa"/>
+              <w:right w:w="100" w:type="dxa"/>
+            </w:tcMar>
+            <w:vAlign w:val="center"/>
+          </w:tcPr>
+          <w:p>
+            <w:r>
+              <w:rPr>
+                <w:sz w:val="22"/>
+                <w:szCs w:val="22"/>
+              </w:rPr>
+              <w:t>the marketplace stays safe and trustworthy</w:t>
+            </w:r>
+          </w:p>
+        </w:tc>
+        <w:tc>
+          <w:tcPr>
+            <w:tcW w:w="1050" w:type="dxa"/>
+            <w:tcMar>
+              <w:top w:w="80" w:type="dxa"/>
+              <w:left w:w="100" w:type="dxa"/>
+              <w:bottom w:w="80" w:type="dxa"/>
+              <w:right w:w="100" w:type="dxa"/>
+            </w:tcMar>
+            <w:vAlign w:val="center"/>
+          </w:tcPr>
+          <w:p>
+            <w:r>
+              <w:rPr>
+                <w:sz w:val="22"/>
+                <w:szCs w:val="22"/>
+              </w:rPr>
+              <w:t>High</w:t>
+            </w:r>
+          </w:p>
+        </w:tc>
+      </w:tr>
+      <w:tr>
+        <w:tblPrEx>
+          <w:tblCellMar>
+            <w:top w:w="0" w:type="dxa"/>
+            <w:bottom w:w="0" w:type="dxa"/>
+          </w:tblCellMar>
+        </w:tblPrEx>
+        <w:tc>
+          <w:tcPr>
+            <w:tcW w:w="787" w:type="dxa"/>
+            <w:tcMar>
+              <w:top w:w="80" w:type="dxa"/>
+              <w:left w:w="100" w:type="dxa"/>
+              <w:bottom w:w="80" w:type="dxa"/>
+              <w:right w:w="100" w:type="dxa"/>
+            </w:tcMar>
+            <w:vAlign w:val="center"/>
+          </w:tcPr>
+          <w:p>
+            <w:r>
+              <w:rPr>
+                <w:sz w:val="22"/>
+                <w:szCs w:val="22"/>
+              </w:rPr>
+              <w:t>US-11</w:t>
+            </w:r>
+          </w:p>
+        </w:tc>
+        <w:tc>
+          <w:tcPr>
+            <w:tcW w:w="1924" w:type="dxa"/>
+            <w:tcMar>
+              <w:top w:w="80" w:type="dxa"/>
+              <w:left w:w="100" w:type="dxa"/>
+              <w:bottom w:w="80" w:type="dxa"/>
+              <w:right w:w="100" w:type="dxa"/>
+            </w:tcMar>
+            <w:vAlign w:val="center"/>
+          </w:tcPr>
+          <w:p>
+            <w:r>
+              <w:rPr>
+                <w:sz w:val="22"/>
+                <w:szCs w:val="22"/>
+              </w:rPr>
+              <w:t>Administrator</w:t>
+            </w:r>
+          </w:p>
+        </w:tc>
+        <w:tc>
+          <w:tcPr>
+            <w:tcW w:w="2799" w:type="dxa"/>
+            <w:tcMar>
+              <w:top w:w="80" w:type="dxa"/>
+              <w:left w:w="100" w:type="dxa"/>
+              <w:bottom w:w="80" w:type="dxa"/>
+              <w:right w:w="100" w:type="dxa"/>
+            </w:tcMar>
+            <w:vAlign w:val="center"/>
+          </w:tcPr>
+          <w:p>
+            <w:r>
+              <w:rPr>
+                <w:sz w:val="22"/>
+                <w:szCs w:val="22"/>
+              </w:rPr>
+              <w:t>suspend a user account</w:t>
+            </w:r>
+          </w:p>
+        </w:tc>
+        <w:tc>
+          <w:tcPr>
+            <w:tcW w:w="2799" w:type="dxa"/>
+            <w:tcMar>
+              <w:top w:w="80" w:type="dxa"/>
+              <w:left w:w="100" w:type="dxa"/>
+              <w:bottom w:w="80" w:type="dxa"/>
+              <w:right w:w="100" w:type="dxa"/>
+            </w:tcMar>
+            <w:vAlign w:val="center"/>
+          </w:tcPr>
+          <w:p>
+            <w:r>
+              <w:rPr>
+                <w:sz w:val="22"/>
+                <w:szCs w:val="22"/>
+              </w:rPr>
+              <w:t>repeat offenders cannot continue misusing the platform</w:t>
+            </w:r>
+          </w:p>
+        </w:tc>
+        <w:tc>
+          <w:tcPr>
+            <w:tcW w:w="1050" w:type="dxa"/>
+            <w:tcMar>
+              <w:top w:w="80" w:type="dxa"/>
+              <w:left w:w="100" w:type="dxa"/>
+              <w:bottom w:w="80" w:type="dxa"/>
+              <w:right w:w="100" w:type="dxa"/>
+            </w:tcMar>
+            <w:vAlign w:val="center"/>
+          </w:tcPr>
+          <w:p>
+            <w:r>
+              <w:rPr>
+                <w:sz w:val="22"/>
+                <w:szCs w:val="22"/>
+              </w:rPr>
+              <w:t>Medium</w:t>
+            </w:r>
+          </w:p>
+        </w:tc>
+      </w:tr>
+    </w:tbl>
+    <w:p>
+      <w:pPr>
+        <w:pStyle w:val="Heading1"/>
+        <w:spacing w:before="360" w:after="180"/>
+      </w:pPr>
     </w:p>
     <w:sectPr>
       <w:pgSz w:w="12240" w:h="15840"/>
@@ -1630,10 +2821,96 @@
 <file path=word/numbering.xml><?xml version="1.0" encoding="utf-8"?>
 <w:numbering xmlns:wpc="http://schemas.microsoft.com/office/word/2010/wordprocessingCanvas" xmlns:cx="http://schemas.microsoft.com/office/drawing/2014/chartex" xmlns:cx1="http://schemas.microsoft.com/office/drawing/2015/9/8/chartex" xmlns:cx2="http://schemas.microsoft.com/office/drawing/2015/10/21/chartex" xmlns:cx3="http://schemas.microsoft.com/office/drawing/2016/5/9/chartex" xmlns:cx4="http://schemas.microsoft.com/office/drawing/2016/5/10/chartex" xmlns:cx5="http://schemas.microsoft.com/office/drawing/2016/5/11/chartex" xmlns:cx6="http://schemas.microsoft.com/office/drawing/2016/5/12/chartex" xmlns:cx7="http://schemas.microsoft.com/office/drawing/2016/5/13/chartex" xmlns:cx8="http://schemas.microsoft.com/office/drawing/2016/5/14/chartex" xmlns:mc="http://schemas.openxmlformats.org/markup-compatibility/2006" xmlns:aink="http://schemas.microsoft.com/office/drawing/2016/ink" xmlns:am3d="http://schemas.microsoft.com/office/drawing/2017/model3d" xmlns:o="urn:schemas-microsoft-com:office:office" xmlns:oel="http://schemas.microsoft.com/office/2019/extlst" xmlns:r="http://schemas.openxmlformats.org/officeDocument/2006/relationships" xmlns:m="http://schemas.openxmlformats.org/officeDocument/2006/math" xmlns:v="urn:schemas-microsoft-com:vml" xmlns:wp14="http://schemas.microsoft.com/office/word/2010/wordprocessingDrawing" xmlns:wp="http://schemas.openxmlformats.org/drawingml/2006/wordprocessingDrawing" xmlns:w10="urn:schemas-microsoft-com:office:word" xmlns:w="http://schemas.openxmlformats.org/wordprocessingml/2006/main" xmlns:w14="http://schemas.microsoft.com/office/word/2010/wordml" xmlns:w15="http://schemas.microsoft.com/office/word/2012/wordml" xmlns:w16cex="http://schemas.microsoft.com/office/word/2018/wordml/cex" xmlns:w16cid="http://schemas.microsoft.com/office/word/2016/wordml/cid" xmlns:w16="http://schemas.microsoft.com/office/word/2018/wordml" xmlns:w16sdtdh="http://schemas.microsoft.com/office/word/2020/wordml/sdtdatahash" xmlns:w16se="http://schemas.microsoft.com/office/word/2015/wordml/symex" xmlns:wpg="http://schemas.microsoft.com/office/word/2010/wordprocessingGroup" xmlns:wpi="http://schemas.microsoft.com/office/word/2010/wordprocessingInk" xmlns:wne="http://schemas.microsoft.com/office/word/2006/wordml" xmlns:wps="http://schemas.microsoft.com/office/word/2010/wordprocessingShape" mc:Ignorable="w14 w15 w16se w16cid w16 w16cex w16sdtdh wp14">
   <w:abstractNum w:abstractNumId="0" w15:restartNumberingAfterBreak="0">
-    <w:nsid w:val="032302D3"/>
+    <w:nsid w:val="13F552FF"/>
     <w:multiLevelType w:val="hybridMultilevel"/>
-    <w:tmpl w:val="171CD4C6"/>
-    <w:lvl w:ilvl="0" w:tplc="6B4A5374">
+    <w:tmpl w:val="741CC89E"/>
+    <w:lvl w:ilvl="0" w:tplc="F46C6C46">
+      <w:start w:val="1"/>
+      <w:numFmt w:val="bullet"/>
+      <w:lvlText w:val="●"/>
+      <w:lvlJc w:val="left"/>
+      <w:pPr>
+        <w:ind w:left="720" w:hanging="360"/>
+      </w:pPr>
+    </w:lvl>
+    <w:lvl w:ilvl="1" w:tplc="3DC8B590">
+      <w:start w:val="1"/>
+      <w:numFmt w:val="bullet"/>
+      <w:lvlText w:val="○"/>
+      <w:lvlJc w:val="left"/>
+      <w:pPr>
+        <w:ind w:left="1440" w:hanging="360"/>
+      </w:pPr>
+    </w:lvl>
+    <w:lvl w:ilvl="2" w:tplc="F962B9B0">
+      <w:start w:val="1"/>
+      <w:numFmt w:val="bullet"/>
+      <w:lvlText w:val="■"/>
+      <w:lvlJc w:val="left"/>
+      <w:pPr>
+        <w:ind w:left="2160" w:hanging="360"/>
+      </w:pPr>
+    </w:lvl>
+    <w:lvl w:ilvl="3" w:tplc="47029E3A">
+      <w:start w:val="1"/>
+      <w:numFmt w:val="bullet"/>
+      <w:lvlText w:val="●"/>
+      <w:lvlJc w:val="left"/>
+      <w:pPr>
+        <w:ind w:left="2880" w:hanging="360"/>
+      </w:pPr>
+    </w:lvl>
+    <w:lvl w:ilvl="4" w:tplc="83AE1D36">
+      <w:start w:val="1"/>
+      <w:numFmt w:val="bullet"/>
+      <w:lvlText w:val="○"/>
+      <w:lvlJc w:val="left"/>
+      <w:pPr>
+        <w:ind w:left="3600" w:hanging="360"/>
+      </w:pPr>
+    </w:lvl>
+    <w:lvl w:ilvl="5" w:tplc="0E3A2BA2">
+      <w:start w:val="1"/>
+      <w:numFmt w:val="bullet"/>
+      <w:lvlText w:val="■"/>
+      <w:lvlJc w:val="left"/>
+      <w:pPr>
+        <w:ind w:left="4320" w:hanging="360"/>
+      </w:pPr>
+    </w:lvl>
+    <w:lvl w:ilvl="6" w:tplc="5EC4F41E">
+      <w:start w:val="1"/>
+      <w:numFmt w:val="bullet"/>
+      <w:lvlText w:val="●"/>
+      <w:lvlJc w:val="left"/>
+      <w:pPr>
+        <w:ind w:left="5040" w:hanging="360"/>
+      </w:pPr>
+    </w:lvl>
+    <w:lvl w:ilvl="7" w:tplc="E8AA8354">
+      <w:start w:val="1"/>
+      <w:numFmt w:val="bullet"/>
+      <w:lvlText w:val="●"/>
+      <w:lvlJc w:val="left"/>
+      <w:pPr>
+        <w:ind w:left="5760" w:hanging="360"/>
+      </w:pPr>
+    </w:lvl>
+    <w:lvl w:ilvl="8" w:tplc="BBAA1E84">
+      <w:start w:val="1"/>
+      <w:numFmt w:val="bullet"/>
+      <w:lvlText w:val="●"/>
+      <w:lvlJc w:val="left"/>
+      <w:pPr>
+        <w:ind w:left="6480" w:hanging="360"/>
+      </w:pPr>
+    </w:lvl>
+  </w:abstractNum>
+  <w:abstractNum w:abstractNumId="1" w15:restartNumberingAfterBreak="0">
+    <w:nsid w:val="7EB06FB0"/>
+    <w:multiLevelType w:val="hybridMultilevel"/>
+    <w:tmpl w:val="EA822BF6"/>
+    <w:lvl w:ilvl="0" w:tplc="E7BEFF76">
       <w:start w:val="1"/>
       <w:numFmt w:val="bullet"/>
       <w:lvlText w:val="•"/>
@@ -1642,135 +2919,49 @@
         <w:ind w:left="480" w:hanging="240"/>
       </w:pPr>
     </w:lvl>
-    <w:lvl w:ilvl="1" w:tplc="15A0E97C">
+    <w:lvl w:ilvl="1" w:tplc="E97AA2BC">
       <w:numFmt w:val="decimal"/>
       <w:lvlText w:val=""/>
       <w:lvlJc w:val="left"/>
     </w:lvl>
-    <w:lvl w:ilvl="2" w:tplc="CF08067C">
+    <w:lvl w:ilvl="2" w:tplc="B7420A6C">
       <w:numFmt w:val="decimal"/>
       <w:lvlText w:val=""/>
       <w:lvlJc w:val="left"/>
     </w:lvl>
-    <w:lvl w:ilvl="3" w:tplc="0CB2584E">
+    <w:lvl w:ilvl="3" w:tplc="51CED750">
       <w:numFmt w:val="decimal"/>
       <w:lvlText w:val=""/>
       <w:lvlJc w:val="left"/>
     </w:lvl>
-    <w:lvl w:ilvl="4" w:tplc="291679DE">
+    <w:lvl w:ilvl="4" w:tplc="AE6E3FF0">
       <w:numFmt w:val="decimal"/>
       <w:lvlText w:val=""/>
       <w:lvlJc w:val="left"/>
     </w:lvl>
-    <w:lvl w:ilvl="5" w:tplc="A5229842">
+    <w:lvl w:ilvl="5" w:tplc="30AA6412">
       <w:numFmt w:val="decimal"/>
       <w:lvlText w:val=""/>
       <w:lvlJc w:val="left"/>
     </w:lvl>
-    <w:lvl w:ilvl="6" w:tplc="CB02BEC4">
+    <w:lvl w:ilvl="6" w:tplc="9712F688">
       <w:numFmt w:val="decimal"/>
       <w:lvlText w:val=""/>
       <w:lvlJc w:val="left"/>
     </w:lvl>
-    <w:lvl w:ilvl="7" w:tplc="0476A614">
+    <w:lvl w:ilvl="7" w:tplc="64881078">
       <w:numFmt w:val="decimal"/>
       <w:lvlText w:val=""/>
       <w:lvlJc w:val="left"/>
     </w:lvl>
-    <w:lvl w:ilvl="8" w:tplc="CEA4EA24">
+    <w:lvl w:ilvl="8" w:tplc="3E1C1A00">
       <w:numFmt w:val="decimal"/>
       <w:lvlText w:val=""/>
       <w:lvlJc w:val="left"/>
     </w:lvl>
   </w:abstractNum>
-  <w:abstractNum w:abstractNumId="1" w15:restartNumberingAfterBreak="0">
-    <w:nsid w:val="3B723CD8"/>
-    <w:multiLevelType w:val="hybridMultilevel"/>
-    <w:tmpl w:val="B83ED610"/>
-    <w:lvl w:ilvl="0" w:tplc="AB02FE7A">
-      <w:start w:val="1"/>
-      <w:numFmt w:val="bullet"/>
-      <w:lvlText w:val="●"/>
-      <w:lvlJc w:val="left"/>
-      <w:pPr>
-        <w:ind w:left="720" w:hanging="360"/>
-      </w:pPr>
-    </w:lvl>
-    <w:lvl w:ilvl="1" w:tplc="29E8F2AA">
-      <w:start w:val="1"/>
-      <w:numFmt w:val="bullet"/>
-      <w:lvlText w:val="○"/>
-      <w:lvlJc w:val="left"/>
-      <w:pPr>
-        <w:ind w:left="1440" w:hanging="360"/>
-      </w:pPr>
-    </w:lvl>
-    <w:lvl w:ilvl="2" w:tplc="168ECC56">
-      <w:start w:val="1"/>
-      <w:numFmt w:val="bullet"/>
-      <w:lvlText w:val="■"/>
-      <w:lvlJc w:val="left"/>
-      <w:pPr>
-        <w:ind w:left="2160" w:hanging="360"/>
-      </w:pPr>
-    </w:lvl>
-    <w:lvl w:ilvl="3" w:tplc="73B4572E">
-      <w:start w:val="1"/>
-      <w:numFmt w:val="bullet"/>
-      <w:lvlText w:val="●"/>
-      <w:lvlJc w:val="left"/>
-      <w:pPr>
-        <w:ind w:left="2880" w:hanging="360"/>
-      </w:pPr>
-    </w:lvl>
-    <w:lvl w:ilvl="4" w:tplc="E910CA60">
-      <w:start w:val="1"/>
-      <w:numFmt w:val="bullet"/>
-      <w:lvlText w:val="○"/>
-      <w:lvlJc w:val="left"/>
-      <w:pPr>
-        <w:ind w:left="3600" w:hanging="360"/>
-      </w:pPr>
-    </w:lvl>
-    <w:lvl w:ilvl="5" w:tplc="3D6E3978">
-      <w:start w:val="1"/>
-      <w:numFmt w:val="bullet"/>
-      <w:lvlText w:val="■"/>
-      <w:lvlJc w:val="left"/>
-      <w:pPr>
-        <w:ind w:left="4320" w:hanging="360"/>
-      </w:pPr>
-    </w:lvl>
-    <w:lvl w:ilvl="6" w:tplc="1A5223B0">
-      <w:start w:val="1"/>
-      <w:numFmt w:val="bullet"/>
-      <w:lvlText w:val="●"/>
-      <w:lvlJc w:val="left"/>
-      <w:pPr>
-        <w:ind w:left="5040" w:hanging="360"/>
-      </w:pPr>
-    </w:lvl>
-    <w:lvl w:ilvl="7" w:tplc="6914C2EA">
-      <w:start w:val="1"/>
-      <w:numFmt w:val="bullet"/>
-      <w:lvlText w:val="●"/>
-      <w:lvlJc w:val="left"/>
-      <w:pPr>
-        <w:ind w:left="5760" w:hanging="360"/>
-      </w:pPr>
-    </w:lvl>
-    <w:lvl w:ilvl="8" w:tplc="40BE434E">
-      <w:start w:val="1"/>
-      <w:numFmt w:val="bullet"/>
-      <w:lvlText w:val="●"/>
-      <w:lvlJc w:val="left"/>
-      <w:pPr>
-        <w:ind w:left="6480" w:hanging="360"/>
-      </w:pPr>
-    </w:lvl>
-  </w:abstractNum>
-  <w:num w:numId="1" w16cid:durableId="1157646380">
-    <w:abstractNumId w:val="1"/>
+  <w:num w:numId="1" w16cid:durableId="444037531">
+    <w:abstractNumId w:val="0"/>
     <w:lvlOverride w:ilvl="0">
       <w:startOverride w:val="1"/>
     </w:lvlOverride>

</xml_diff>